<commit_message>
Add Use Case to software requirements documentation
</commit_message>
<xml_diff>
--- a/Documentation/Software Requirements.docx
+++ b/Documentation/Software Requirements.docx
@@ -517,6 +517,2810 @@
         <w:t>NFR-8: AI Quality and Cost Management – The AI features shall provide responses grounded in available course materials or approved support documentation, identify AI-generated content, and enforce configurable usage limits to manage costs.</w:t>
       </w:r>
     </w:p>
+    <w:p>
+      <w:pPr>
+        <w:rPr>
+          <w:color w:val="000000" w:themeColor="text1"/>
+          <w:rtl/>
+        </w:rPr>
+      </w:pPr>
+    </w:p>
+    <w:p>
+      <w:pPr>
+        <w:rPr>
+          <w:b/>
+          <w:bCs/>
+          <w:color w:val="00B0F0"/>
+          <w:sz w:val="40"/>
+          <w:szCs w:val="40"/>
+        </w:rPr>
+      </w:pPr>
+      <w:r>
+        <w:rPr>
+          <w:b/>
+          <w:bCs/>
+          <w:color w:val="00B0F0"/>
+          <w:sz w:val="40"/>
+          <w:szCs w:val="40"/>
+        </w:rPr>
+        <w:lastRenderedPageBreak/>
+        <w:t>3. Use Cases – Scenarios</w:t>
+      </w:r>
+    </w:p>
+    <w:p>
+      <w:pPr>
+        <w:rPr>
+          <w:color w:val="000000" w:themeColor="text1"/>
+        </w:rPr>
+      </w:pPr>
+      <w:r>
+        <w:rPr>
+          <w:color w:val="000000" w:themeColor="text1"/>
+        </w:rPr>
+        <w:t xml:space="preserve">This section describes the main interactions between users and the </w:t>
+      </w:r>
+      <w:proofErr w:type="spellStart"/>
+      <w:r>
+        <w:rPr>
+          <w:color w:val="000000" w:themeColor="text1"/>
+        </w:rPr>
+        <w:t>EduHub</w:t>
+      </w:r>
+      <w:proofErr w:type="spellEnd"/>
+      <w:r>
+        <w:rPr>
+          <w:color w:val="000000" w:themeColor="text1"/>
+        </w:rPr>
+        <w:t xml:space="preserve"> platform.</w:t>
+      </w:r>
+    </w:p>
+    <w:p>
+      <w:pPr>
+        <w:rPr>
+          <w:b/>
+          <w:bCs/>
+          <w:color w:val="000000" w:themeColor="text1"/>
+        </w:rPr>
+      </w:pPr>
+      <w:r>
+        <w:rPr>
+          <w:b/>
+          <w:bCs/>
+          <w:color w:val="000000" w:themeColor="text1"/>
+        </w:rPr>
+        <w:t>UC-01: User Authentication and Profile Management</w:t>
+      </w:r>
+    </w:p>
+    <w:p>
+      <w:pPr>
+        <w:rPr>
+          <w:color w:val="000000" w:themeColor="text1"/>
+        </w:rPr>
+      </w:pPr>
+      <w:r>
+        <w:rPr>
+          <w:b/>
+          <w:bCs/>
+          <w:color w:val="000000" w:themeColor="text1"/>
+        </w:rPr>
+        <w:t>Actor:</w:t>
+      </w:r>
+      <w:r>
+        <w:rPr>
+          <w:color w:val="000000" w:themeColor="text1"/>
+        </w:rPr>
+        <w:t xml:space="preserve"> Student, Instructor, Admin</w:t>
+      </w:r>
+    </w:p>
+    <w:p>
+      <w:pPr>
+        <w:rPr>
+          <w:color w:val="000000" w:themeColor="text1"/>
+        </w:rPr>
+      </w:pPr>
+      <w:r>
+        <w:rPr>
+          <w:b/>
+          <w:bCs/>
+          <w:color w:val="000000" w:themeColor="text1"/>
+        </w:rPr>
+        <w:t>Scenario:</w:t>
+      </w:r>
+    </w:p>
+    <w:p>
+      <w:pPr>
+        <w:numPr>
+          <w:ilvl w:val="0"/>
+          <w:numId w:val="3"/>
+        </w:numPr>
+        <w:rPr>
+          <w:color w:val="000000" w:themeColor="text1"/>
+        </w:rPr>
+      </w:pPr>
+      <w:r>
+        <w:rPr>
+          <w:color w:val="000000" w:themeColor="text1"/>
+        </w:rPr>
+        <w:t>The user registers or logs in.</w:t>
+      </w:r>
+    </w:p>
+    <w:p>
+      <w:pPr>
+        <w:numPr>
+          <w:ilvl w:val="0"/>
+          <w:numId w:val="3"/>
+        </w:numPr>
+        <w:rPr>
+          <w:color w:val="000000" w:themeColor="text1"/>
+        </w:rPr>
+      </w:pPr>
+      <w:r>
+        <w:rPr>
+          <w:color w:val="000000" w:themeColor="text1"/>
+        </w:rPr>
+        <w:t>The system validates the submitted information.</w:t>
+      </w:r>
+    </w:p>
+    <w:p>
+      <w:pPr>
+        <w:numPr>
+          <w:ilvl w:val="0"/>
+          <w:numId w:val="3"/>
+        </w:numPr>
+        <w:rPr>
+          <w:color w:val="000000" w:themeColor="text1"/>
+        </w:rPr>
+      </w:pPr>
+      <w:r>
+        <w:rPr>
+          <w:color w:val="000000" w:themeColor="text1"/>
+        </w:rPr>
+        <w:t>The user can view and update their profile.</w:t>
+      </w:r>
+    </w:p>
+    <w:p>
+      <w:pPr>
+        <w:numPr>
+          <w:ilvl w:val="0"/>
+          <w:numId w:val="3"/>
+        </w:numPr>
+        <w:rPr>
+          <w:color w:val="000000" w:themeColor="text1"/>
+        </w:rPr>
+      </w:pPr>
+      <w:r>
+        <w:rPr>
+          <w:color w:val="000000" w:themeColor="text1"/>
+        </w:rPr>
+        <w:t>The system grants access according to the user's role.</w:t>
+      </w:r>
+    </w:p>
+    <w:p>
+      <w:pPr>
+        <w:rPr>
+          <w:color w:val="000000" w:themeColor="text1"/>
+        </w:rPr>
+      </w:pPr>
+      <w:r>
+        <w:rPr>
+          <w:b/>
+          <w:bCs/>
+          <w:color w:val="000000" w:themeColor="text1"/>
+        </w:rPr>
+        <w:t>Alternative:</w:t>
+      </w:r>
+      <w:r>
+        <w:rPr>
+          <w:color w:val="000000" w:themeColor="text1"/>
+        </w:rPr>
+        <w:t xml:space="preserve"> If the information is invalid, the system displays an error message.</w:t>
+      </w:r>
+    </w:p>
+    <w:p>
+      <w:pPr>
+        <w:rPr>
+          <w:b/>
+          <w:bCs/>
+          <w:color w:val="000000" w:themeColor="text1"/>
+        </w:rPr>
+      </w:pPr>
+      <w:r>
+        <w:rPr>
+          <w:b/>
+          <w:bCs/>
+          <w:color w:val="000000" w:themeColor="text1"/>
+        </w:rPr>
+        <w:t>UC-02: Browse and Search Courses</w:t>
+      </w:r>
+    </w:p>
+    <w:p>
+      <w:pPr>
+        <w:rPr>
+          <w:color w:val="000000" w:themeColor="text1"/>
+        </w:rPr>
+      </w:pPr>
+      <w:r>
+        <w:rPr>
+          <w:b/>
+          <w:bCs/>
+          <w:color w:val="000000" w:themeColor="text1"/>
+        </w:rPr>
+        <w:t>Actor:</w:t>
+      </w:r>
+      <w:r>
+        <w:rPr>
+          <w:color w:val="000000" w:themeColor="text1"/>
+        </w:rPr>
+        <w:t xml:space="preserve"> Student, Public Visitor</w:t>
+      </w:r>
+    </w:p>
+    <w:p>
+      <w:pPr>
+        <w:rPr>
+          <w:color w:val="000000" w:themeColor="text1"/>
+        </w:rPr>
+      </w:pPr>
+      <w:r>
+        <w:rPr>
+          <w:b/>
+          <w:bCs/>
+          <w:color w:val="000000" w:themeColor="text1"/>
+        </w:rPr>
+        <w:t>Scenario:</w:t>
+      </w:r>
+    </w:p>
+    <w:p>
+      <w:pPr>
+        <w:numPr>
+          <w:ilvl w:val="0"/>
+          <w:numId w:val="4"/>
+        </w:numPr>
+        <w:rPr>
+          <w:color w:val="000000" w:themeColor="text1"/>
+        </w:rPr>
+      </w:pPr>
+      <w:r>
+        <w:rPr>
+          <w:color w:val="000000" w:themeColor="text1"/>
+        </w:rPr>
+        <w:t>The user opens the course catalog.</w:t>
+      </w:r>
+    </w:p>
+    <w:p>
+      <w:pPr>
+        <w:numPr>
+          <w:ilvl w:val="0"/>
+          <w:numId w:val="4"/>
+        </w:numPr>
+        <w:rPr>
+          <w:color w:val="000000" w:themeColor="text1"/>
+        </w:rPr>
+      </w:pPr>
+      <w:r>
+        <w:rPr>
+          <w:color w:val="000000" w:themeColor="text1"/>
+        </w:rPr>
+        <w:t>The user searches, filters, or sorts courses by title, category, price, level, or rating.</w:t>
+      </w:r>
+    </w:p>
+    <w:p>
+      <w:pPr>
+        <w:numPr>
+          <w:ilvl w:val="0"/>
+          <w:numId w:val="4"/>
+        </w:numPr>
+        <w:rPr>
+          <w:color w:val="000000" w:themeColor="text1"/>
+        </w:rPr>
+      </w:pPr>
+      <w:r>
+        <w:rPr>
+          <w:color w:val="000000" w:themeColor="text1"/>
+        </w:rPr>
+        <w:t>The system displays matching published courses.</w:t>
+      </w:r>
+    </w:p>
+    <w:p>
+      <w:pPr>
+        <w:numPr>
+          <w:ilvl w:val="0"/>
+          <w:numId w:val="4"/>
+        </w:numPr>
+        <w:rPr>
+          <w:color w:val="000000" w:themeColor="text1"/>
+        </w:rPr>
+      </w:pPr>
+      <w:r>
+        <w:rPr>
+          <w:color w:val="000000" w:themeColor="text1"/>
+        </w:rPr>
+        <w:t>The user selects a course to view its details.</w:t>
+      </w:r>
+    </w:p>
+    <w:p>
+      <w:pPr>
+        <w:rPr>
+          <w:color w:val="000000" w:themeColor="text1"/>
+        </w:rPr>
+      </w:pPr>
+      <w:r>
+        <w:rPr>
+          <w:b/>
+          <w:bCs/>
+          <w:color w:val="000000" w:themeColor="text1"/>
+        </w:rPr>
+        <w:t>Alternative:</w:t>
+      </w:r>
+      <w:r>
+        <w:rPr>
+          <w:color w:val="000000" w:themeColor="text1"/>
+        </w:rPr>
+        <w:t xml:space="preserve"> If no courses match, the system displays a message.</w:t>
+      </w:r>
+    </w:p>
+    <w:p>
+      <w:pPr>
+        <w:rPr>
+          <w:b/>
+          <w:bCs/>
+          <w:color w:val="000000" w:themeColor="text1"/>
+        </w:rPr>
+      </w:pPr>
+      <w:r>
+        <w:rPr>
+          <w:b/>
+          <w:bCs/>
+          <w:color w:val="000000" w:themeColor="text1"/>
+        </w:rPr>
+        <w:t>UC-03: Course Management</w:t>
+      </w:r>
+    </w:p>
+    <w:p>
+      <w:pPr>
+        <w:rPr>
+          <w:color w:val="000000" w:themeColor="text1"/>
+        </w:rPr>
+      </w:pPr>
+      <w:r>
+        <w:rPr>
+          <w:b/>
+          <w:bCs/>
+          <w:color w:val="000000" w:themeColor="text1"/>
+        </w:rPr>
+        <w:t>Actor:</w:t>
+      </w:r>
+      <w:r>
+        <w:rPr>
+          <w:color w:val="000000" w:themeColor="text1"/>
+        </w:rPr>
+        <w:t xml:space="preserve"> Instructor</w:t>
+      </w:r>
+    </w:p>
+    <w:p>
+      <w:pPr>
+        <w:rPr>
+          <w:color w:val="000000" w:themeColor="text1"/>
+        </w:rPr>
+      </w:pPr>
+      <w:r>
+        <w:rPr>
+          <w:b/>
+          <w:bCs/>
+          <w:color w:val="000000" w:themeColor="text1"/>
+        </w:rPr>
+        <w:t>Scenario:</w:t>
+      </w:r>
+    </w:p>
+    <w:p>
+      <w:pPr>
+        <w:numPr>
+          <w:ilvl w:val="0"/>
+          <w:numId w:val="5"/>
+        </w:numPr>
+        <w:rPr>
+          <w:color w:val="000000" w:themeColor="text1"/>
+        </w:rPr>
+      </w:pPr>
+      <w:r>
+        <w:rPr>
+          <w:color w:val="000000" w:themeColor="text1"/>
+        </w:rPr>
+        <w:t>The instructor creates or edits a course.</w:t>
+      </w:r>
+    </w:p>
+    <w:p>
+      <w:pPr>
+        <w:numPr>
+          <w:ilvl w:val="0"/>
+          <w:numId w:val="5"/>
+        </w:numPr>
+        <w:rPr>
+          <w:color w:val="000000" w:themeColor="text1"/>
+        </w:rPr>
+      </w:pPr>
+      <w:r>
+        <w:rPr>
+          <w:color w:val="000000" w:themeColor="text1"/>
+        </w:rPr>
+        <w:t>The instructor adds sections, lessons, descriptions, thumbnails, and pricing.</w:t>
+      </w:r>
+    </w:p>
+    <w:p>
+      <w:pPr>
+        <w:numPr>
+          <w:ilvl w:val="0"/>
+          <w:numId w:val="5"/>
+        </w:numPr>
+        <w:rPr>
+          <w:color w:val="000000" w:themeColor="text1"/>
+        </w:rPr>
+      </w:pPr>
+      <w:r>
+        <w:rPr>
+          <w:color w:val="000000" w:themeColor="text1"/>
+        </w:rPr>
+        <w:t>The instructor previews the course and saves it as a draft or submits it for approval.</w:t>
+      </w:r>
+    </w:p>
+    <w:p>
+      <w:pPr>
+        <w:numPr>
+          <w:ilvl w:val="0"/>
+          <w:numId w:val="5"/>
+        </w:numPr>
+        <w:rPr>
+          <w:color w:val="000000" w:themeColor="text1"/>
+        </w:rPr>
+      </w:pPr>
+      <w:r>
+        <w:rPr>
+          <w:color w:val="000000" w:themeColor="text1"/>
+        </w:rPr>
+        <w:t>The system saves the course and updates its status.</w:t>
+      </w:r>
+    </w:p>
+    <w:p>
+      <w:pPr>
+        <w:rPr>
+          <w:color w:val="000000" w:themeColor="text1"/>
+        </w:rPr>
+      </w:pPr>
+      <w:r>
+        <w:rPr>
+          <w:b/>
+          <w:bCs/>
+          <w:color w:val="000000" w:themeColor="text1"/>
+        </w:rPr>
+        <w:lastRenderedPageBreak/>
+        <w:t>Alternative:</w:t>
+      </w:r>
+      <w:r>
+        <w:rPr>
+          <w:color w:val="000000" w:themeColor="text1"/>
+        </w:rPr>
+        <w:t xml:space="preserve"> The system requests corrections if required information is missing.</w:t>
+      </w:r>
+    </w:p>
+    <w:p>
+      <w:pPr>
+        <w:rPr>
+          <w:b/>
+          <w:bCs/>
+          <w:color w:val="000000" w:themeColor="text1"/>
+        </w:rPr>
+      </w:pPr>
+      <w:r>
+        <w:rPr>
+          <w:b/>
+          <w:bCs/>
+          <w:color w:val="000000" w:themeColor="text1"/>
+        </w:rPr>
+        <w:t>UC-04: Upload and Stream Videos</w:t>
+      </w:r>
+    </w:p>
+    <w:p>
+      <w:pPr>
+        <w:rPr>
+          <w:color w:val="000000" w:themeColor="text1"/>
+        </w:rPr>
+      </w:pPr>
+      <w:r>
+        <w:rPr>
+          <w:b/>
+          <w:bCs/>
+          <w:color w:val="000000" w:themeColor="text1"/>
+        </w:rPr>
+        <w:t>Actors:</w:t>
+      </w:r>
+      <w:r>
+        <w:rPr>
+          <w:color w:val="000000" w:themeColor="text1"/>
+        </w:rPr>
+        <w:t xml:space="preserve"> Instructor, Student</w:t>
+      </w:r>
+    </w:p>
+    <w:p>
+      <w:pPr>
+        <w:rPr>
+          <w:color w:val="000000" w:themeColor="text1"/>
+        </w:rPr>
+      </w:pPr>
+      <w:r>
+        <w:rPr>
+          <w:b/>
+          <w:bCs/>
+          <w:color w:val="000000" w:themeColor="text1"/>
+        </w:rPr>
+        <w:t>Scenario:</w:t>
+      </w:r>
+    </w:p>
+    <w:p>
+      <w:pPr>
+        <w:numPr>
+          <w:ilvl w:val="0"/>
+          <w:numId w:val="6"/>
+        </w:numPr>
+        <w:rPr>
+          <w:color w:val="000000" w:themeColor="text1"/>
+        </w:rPr>
+      </w:pPr>
+      <w:r>
+        <w:rPr>
+          <w:color w:val="000000" w:themeColor="text1"/>
+        </w:rPr>
+        <w:t>The instructor uploads lesson videos to Azure Blob Storage.</w:t>
+      </w:r>
+    </w:p>
+    <w:p>
+      <w:pPr>
+        <w:numPr>
+          <w:ilvl w:val="0"/>
+          <w:numId w:val="6"/>
+        </w:numPr>
+        <w:rPr>
+          <w:color w:val="000000" w:themeColor="text1"/>
+        </w:rPr>
+      </w:pPr>
+      <w:r>
+        <w:rPr>
+          <w:color w:val="000000" w:themeColor="text1"/>
+        </w:rPr>
+        <w:t>The system stores the video references.</w:t>
+      </w:r>
+    </w:p>
+    <w:p>
+      <w:pPr>
+        <w:numPr>
+          <w:ilvl w:val="0"/>
+          <w:numId w:val="6"/>
+        </w:numPr>
+        <w:rPr>
+          <w:color w:val="000000" w:themeColor="text1"/>
+        </w:rPr>
+      </w:pPr>
+      <w:r>
+        <w:rPr>
+          <w:color w:val="000000" w:themeColor="text1"/>
+        </w:rPr>
+        <w:t>An enrolled student opens a lesson.</w:t>
+      </w:r>
+    </w:p>
+    <w:p>
+      <w:pPr>
+        <w:numPr>
+          <w:ilvl w:val="0"/>
+          <w:numId w:val="6"/>
+        </w:numPr>
+        <w:rPr>
+          <w:color w:val="000000" w:themeColor="text1"/>
+        </w:rPr>
+      </w:pPr>
+      <w:r>
+        <w:rPr>
+          <w:color w:val="000000" w:themeColor="text1"/>
+        </w:rPr>
+        <w:t>The system verifies access and enables video streaming.</w:t>
+      </w:r>
+    </w:p>
+    <w:p>
+      <w:pPr>
+        <w:rPr>
+          <w:color w:val="000000" w:themeColor="text1"/>
+        </w:rPr>
+      </w:pPr>
+      <w:r>
+        <w:rPr>
+          <w:b/>
+          <w:bCs/>
+          <w:color w:val="000000" w:themeColor="text1"/>
+        </w:rPr>
+        <w:t>Alternative:</w:t>
+      </w:r>
+      <w:r>
+        <w:rPr>
+          <w:color w:val="000000" w:themeColor="text1"/>
+        </w:rPr>
+        <w:t xml:space="preserve"> The system rejects unauthorized access or reports upload failures.</w:t>
+      </w:r>
+    </w:p>
+    <w:p>
+      <w:pPr>
+        <w:rPr>
+          <w:b/>
+          <w:bCs/>
+          <w:color w:val="000000" w:themeColor="text1"/>
+        </w:rPr>
+      </w:pPr>
+      <w:r>
+        <w:rPr>
+          <w:b/>
+          <w:bCs/>
+          <w:color w:val="000000" w:themeColor="text1"/>
+        </w:rPr>
+        <w:t>UC-05: Course Enrollment and Payment</w:t>
+      </w:r>
+    </w:p>
+    <w:p>
+      <w:pPr>
+        <w:rPr>
+          <w:color w:val="000000" w:themeColor="text1"/>
+        </w:rPr>
+      </w:pPr>
+      <w:r>
+        <w:rPr>
+          <w:b/>
+          <w:bCs/>
+          <w:color w:val="000000" w:themeColor="text1"/>
+        </w:rPr>
+        <w:t>Actor:</w:t>
+      </w:r>
+      <w:r>
+        <w:rPr>
+          <w:color w:val="000000" w:themeColor="text1"/>
+        </w:rPr>
+        <w:t xml:space="preserve"> Student</w:t>
+      </w:r>
+    </w:p>
+    <w:p>
+      <w:pPr>
+        <w:rPr>
+          <w:color w:val="000000" w:themeColor="text1"/>
+        </w:rPr>
+      </w:pPr>
+      <w:r>
+        <w:rPr>
+          <w:b/>
+          <w:bCs/>
+          <w:color w:val="000000" w:themeColor="text1"/>
+        </w:rPr>
+        <w:t>Supporting System:</w:t>
+      </w:r>
+      <w:r>
+        <w:rPr>
+          <w:color w:val="000000" w:themeColor="text1"/>
+        </w:rPr>
+        <w:t xml:space="preserve"> Stripe</w:t>
+      </w:r>
+    </w:p>
+    <w:p>
+      <w:pPr>
+        <w:rPr>
+          <w:color w:val="000000" w:themeColor="text1"/>
+        </w:rPr>
+      </w:pPr>
+      <w:r>
+        <w:rPr>
+          <w:b/>
+          <w:bCs/>
+          <w:color w:val="000000" w:themeColor="text1"/>
+        </w:rPr>
+        <w:t>Scenario:</w:t>
+      </w:r>
+    </w:p>
+    <w:p>
+      <w:pPr>
+        <w:numPr>
+          <w:ilvl w:val="0"/>
+          <w:numId w:val="7"/>
+        </w:numPr>
+        <w:rPr>
+          <w:color w:val="000000" w:themeColor="text1"/>
+        </w:rPr>
+      </w:pPr>
+      <w:r>
+        <w:rPr>
+          <w:color w:val="000000" w:themeColor="text1"/>
+        </w:rPr>
+        <w:t>The student selects a free or paid course.</w:t>
+      </w:r>
+    </w:p>
+    <w:p>
+      <w:pPr>
+        <w:numPr>
+          <w:ilvl w:val="0"/>
+          <w:numId w:val="7"/>
+        </w:numPr>
+        <w:rPr>
+          <w:color w:val="000000" w:themeColor="text1"/>
+        </w:rPr>
+      </w:pPr>
+      <w:r>
+        <w:rPr>
+          <w:color w:val="000000" w:themeColor="text1"/>
+        </w:rPr>
+        <w:t>For a free course, the system creates an enrollment.</w:t>
+      </w:r>
+    </w:p>
+    <w:p>
+      <w:pPr>
+        <w:numPr>
+          <w:ilvl w:val="0"/>
+          <w:numId w:val="7"/>
+        </w:numPr>
+        <w:rPr>
+          <w:color w:val="000000" w:themeColor="text1"/>
+        </w:rPr>
+      </w:pPr>
+      <w:r>
+        <w:rPr>
+          <w:color w:val="000000" w:themeColor="text1"/>
+        </w:rPr>
+        <w:t>For a paid course, the student optionally applies a coupon and proceeds to checkout.</w:t>
+      </w:r>
+    </w:p>
+    <w:p>
+      <w:pPr>
+        <w:numPr>
+          <w:ilvl w:val="0"/>
+          <w:numId w:val="7"/>
+        </w:numPr>
+        <w:rPr>
+          <w:color w:val="000000" w:themeColor="text1"/>
+        </w:rPr>
+      </w:pPr>
+      <w:r>
+        <w:rPr>
+          <w:color w:val="000000" w:themeColor="text1"/>
+        </w:rPr>
+        <w:t>Stripe processes the payment.</w:t>
+      </w:r>
+    </w:p>
+    <w:p>
+      <w:pPr>
+        <w:numPr>
+          <w:ilvl w:val="0"/>
+          <w:numId w:val="7"/>
+        </w:numPr>
+        <w:rPr>
+          <w:color w:val="000000" w:themeColor="text1"/>
+        </w:rPr>
+      </w:pPr>
+      <w:r>
+        <w:rPr>
+          <w:color w:val="000000" w:themeColor="text1"/>
+        </w:rPr>
+        <w:t>After successful payment confirmation, the system records the transaction and grants course access.</w:t>
+      </w:r>
+    </w:p>
+    <w:p>
+      <w:pPr>
+        <w:rPr>
+          <w:color w:val="000000" w:themeColor="text1"/>
+        </w:rPr>
+      </w:pPr>
+      <w:r>
+        <w:rPr>
+          <w:b/>
+          <w:bCs/>
+          <w:color w:val="000000" w:themeColor="text1"/>
+        </w:rPr>
+        <w:t>Alternative:</w:t>
+      </w:r>
+      <w:r>
+        <w:rPr>
+          <w:color w:val="000000" w:themeColor="text1"/>
+        </w:rPr>
+        <w:t xml:space="preserve"> If payment fails, the system does not grant access to the paid course.</w:t>
+      </w:r>
+    </w:p>
+    <w:p>
+      <w:pPr>
+        <w:rPr>
+          <w:b/>
+          <w:bCs/>
+          <w:color w:val="000000" w:themeColor="text1"/>
+        </w:rPr>
+      </w:pPr>
+      <w:r>
+        <w:rPr>
+          <w:b/>
+          <w:bCs/>
+          <w:color w:val="000000" w:themeColor="text1"/>
+        </w:rPr>
+        <w:t>UC-06: Learning Progress and Assessments</w:t>
+      </w:r>
+    </w:p>
+    <w:p>
+      <w:pPr>
+        <w:rPr>
+          <w:color w:val="000000" w:themeColor="text1"/>
+        </w:rPr>
+      </w:pPr>
+      <w:r>
+        <w:rPr>
+          <w:b/>
+          <w:bCs/>
+          <w:color w:val="000000" w:themeColor="text1"/>
+        </w:rPr>
+        <w:t>Actor:</w:t>
+      </w:r>
+      <w:r>
+        <w:rPr>
+          <w:color w:val="000000" w:themeColor="text1"/>
+        </w:rPr>
+        <w:t xml:space="preserve"> Student</w:t>
+      </w:r>
+    </w:p>
+    <w:p>
+      <w:pPr>
+        <w:rPr>
+          <w:color w:val="000000" w:themeColor="text1"/>
+        </w:rPr>
+      </w:pPr>
+      <w:r>
+        <w:rPr>
+          <w:b/>
+          <w:bCs/>
+          <w:color w:val="000000" w:themeColor="text1"/>
+        </w:rPr>
+        <w:t>Scenario:</w:t>
+      </w:r>
+    </w:p>
+    <w:p>
+      <w:pPr>
+        <w:numPr>
+          <w:ilvl w:val="0"/>
+          <w:numId w:val="8"/>
+        </w:numPr>
+        <w:rPr>
+          <w:color w:val="000000" w:themeColor="text1"/>
+        </w:rPr>
+      </w:pPr>
+      <w:r>
+        <w:rPr>
+          <w:color w:val="000000" w:themeColor="text1"/>
+        </w:rPr>
+        <w:t>The student watches lessons and marks them as completed.</w:t>
+      </w:r>
+    </w:p>
+    <w:p>
+      <w:pPr>
+        <w:numPr>
+          <w:ilvl w:val="0"/>
+          <w:numId w:val="8"/>
+        </w:numPr>
+        <w:rPr>
+          <w:color w:val="000000" w:themeColor="text1"/>
+        </w:rPr>
+      </w:pPr>
+      <w:r>
+        <w:rPr>
+          <w:color w:val="000000" w:themeColor="text1"/>
+        </w:rPr>
+        <w:t>The system updates course progress.</w:t>
+      </w:r>
+    </w:p>
+    <w:p>
+      <w:pPr>
+        <w:numPr>
+          <w:ilvl w:val="0"/>
+          <w:numId w:val="8"/>
+        </w:numPr>
+        <w:rPr>
+          <w:color w:val="000000" w:themeColor="text1"/>
+        </w:rPr>
+      </w:pPr>
+      <w:r>
+        <w:rPr>
+          <w:color w:val="000000" w:themeColor="text1"/>
+        </w:rPr>
+        <w:t>The student can save notes and bookmark lessons.</w:t>
+      </w:r>
+    </w:p>
+    <w:p>
+      <w:pPr>
+        <w:numPr>
+          <w:ilvl w:val="0"/>
+          <w:numId w:val="8"/>
+        </w:numPr>
+        <w:rPr>
+          <w:color w:val="000000" w:themeColor="text1"/>
+        </w:rPr>
+      </w:pPr>
+      <w:r>
+        <w:rPr>
+          <w:color w:val="000000" w:themeColor="text1"/>
+        </w:rPr>
+        <w:lastRenderedPageBreak/>
+        <w:t>The student completes available quizzes.</w:t>
+      </w:r>
+    </w:p>
+    <w:p>
+      <w:pPr>
+        <w:numPr>
+          <w:ilvl w:val="0"/>
+          <w:numId w:val="8"/>
+        </w:numPr>
+        <w:rPr>
+          <w:color w:val="000000" w:themeColor="text1"/>
+        </w:rPr>
+      </w:pPr>
+      <w:r>
+        <w:rPr>
+          <w:color w:val="000000" w:themeColor="text1"/>
+        </w:rPr>
+        <w:t>The system calculates scores and checks the passing requirements.</w:t>
+      </w:r>
+    </w:p>
+    <w:p>
+      <w:pPr>
+        <w:rPr>
+          <w:color w:val="000000" w:themeColor="text1"/>
+        </w:rPr>
+      </w:pPr>
+      <w:r>
+        <w:rPr>
+          <w:b/>
+          <w:bCs/>
+          <w:color w:val="000000" w:themeColor="text1"/>
+        </w:rPr>
+        <w:t>Alternative:</w:t>
+      </w:r>
+      <w:r>
+        <w:rPr>
+          <w:color w:val="000000" w:themeColor="text1"/>
+        </w:rPr>
+        <w:t xml:space="preserve"> If the passing score is not achieved, the system displays the result and allows another attempt when permitted.</w:t>
+      </w:r>
+    </w:p>
+    <w:p>
+      <w:pPr>
+        <w:rPr>
+          <w:b/>
+          <w:bCs/>
+          <w:color w:val="000000" w:themeColor="text1"/>
+        </w:rPr>
+      </w:pPr>
+      <w:r>
+        <w:rPr>
+          <w:b/>
+          <w:bCs/>
+          <w:color w:val="000000" w:themeColor="text1"/>
+        </w:rPr>
+        <w:t>UC-07: Course Reviews and Ratings</w:t>
+      </w:r>
+    </w:p>
+    <w:p>
+      <w:pPr>
+        <w:rPr>
+          <w:color w:val="000000" w:themeColor="text1"/>
+        </w:rPr>
+      </w:pPr>
+      <w:r>
+        <w:rPr>
+          <w:b/>
+          <w:bCs/>
+          <w:color w:val="000000" w:themeColor="text1"/>
+        </w:rPr>
+        <w:t>Actor:</w:t>
+      </w:r>
+      <w:r>
+        <w:rPr>
+          <w:color w:val="000000" w:themeColor="text1"/>
+        </w:rPr>
+        <w:t xml:space="preserve"> Student</w:t>
+      </w:r>
+    </w:p>
+    <w:p>
+      <w:pPr>
+        <w:rPr>
+          <w:color w:val="000000" w:themeColor="text1"/>
+        </w:rPr>
+      </w:pPr>
+      <w:r>
+        <w:rPr>
+          <w:b/>
+          <w:bCs/>
+          <w:color w:val="000000" w:themeColor="text1"/>
+        </w:rPr>
+        <w:t>Scenario:</w:t>
+      </w:r>
+    </w:p>
+    <w:p>
+      <w:pPr>
+        <w:numPr>
+          <w:ilvl w:val="0"/>
+          <w:numId w:val="9"/>
+        </w:numPr>
+        <w:rPr>
+          <w:color w:val="000000" w:themeColor="text1"/>
+        </w:rPr>
+      </w:pPr>
+      <w:r>
+        <w:rPr>
+          <w:color w:val="000000" w:themeColor="text1"/>
+        </w:rPr>
+        <w:t>The student opens an eligible course.</w:t>
+      </w:r>
+    </w:p>
+    <w:p>
+      <w:pPr>
+        <w:numPr>
+          <w:ilvl w:val="0"/>
+          <w:numId w:val="9"/>
+        </w:numPr>
+        <w:rPr>
+          <w:color w:val="000000" w:themeColor="text1"/>
+        </w:rPr>
+      </w:pPr>
+      <w:r>
+        <w:rPr>
+          <w:color w:val="000000" w:themeColor="text1"/>
+        </w:rPr>
+        <w:t>The student submits a rating and optional written review.</w:t>
+      </w:r>
+    </w:p>
+    <w:p>
+      <w:pPr>
+        <w:numPr>
+          <w:ilvl w:val="0"/>
+          <w:numId w:val="9"/>
+        </w:numPr>
+        <w:rPr>
+          <w:color w:val="000000" w:themeColor="text1"/>
+        </w:rPr>
+      </w:pPr>
+      <w:r>
+        <w:rPr>
+          <w:color w:val="000000" w:themeColor="text1"/>
+        </w:rPr>
+        <w:t>The system validates and saves the review.</w:t>
+      </w:r>
+    </w:p>
+    <w:p>
+      <w:pPr>
+        <w:numPr>
+          <w:ilvl w:val="0"/>
+          <w:numId w:val="9"/>
+        </w:numPr>
+        <w:rPr>
+          <w:color w:val="000000" w:themeColor="text1"/>
+        </w:rPr>
+      </w:pPr>
+      <w:r>
+        <w:rPr>
+          <w:color w:val="000000" w:themeColor="text1"/>
+        </w:rPr>
+        <w:t>The system updates the course's average rating.</w:t>
+      </w:r>
+    </w:p>
+    <w:p>
+      <w:pPr>
+        <w:rPr>
+          <w:color w:val="000000" w:themeColor="text1"/>
+        </w:rPr>
+      </w:pPr>
+      <w:r>
+        <w:rPr>
+          <w:b/>
+          <w:bCs/>
+          <w:color w:val="000000" w:themeColor="text1"/>
+        </w:rPr>
+        <w:t>Alternative:</w:t>
+      </w:r>
+      <w:r>
+        <w:rPr>
+          <w:color w:val="000000" w:themeColor="text1"/>
+        </w:rPr>
+        <w:t xml:space="preserve"> The system rejects invalid ratings or handles duplicate reviews according to platform rules.</w:t>
+      </w:r>
+    </w:p>
+    <w:p>
+      <w:pPr>
+        <w:rPr>
+          <w:b/>
+          <w:bCs/>
+          <w:color w:val="000000" w:themeColor="text1"/>
+        </w:rPr>
+      </w:pPr>
+      <w:r>
+        <w:rPr>
+          <w:b/>
+          <w:bCs/>
+          <w:color w:val="000000" w:themeColor="text1"/>
+        </w:rPr>
+        <w:t>UC-08: AI Lesson Summarization</w:t>
+      </w:r>
+    </w:p>
+    <w:p>
+      <w:pPr>
+        <w:rPr>
+          <w:color w:val="000000" w:themeColor="text1"/>
+        </w:rPr>
+      </w:pPr>
+      <w:r>
+        <w:rPr>
+          <w:b/>
+          <w:bCs/>
+          <w:color w:val="000000" w:themeColor="text1"/>
+        </w:rPr>
+        <w:t>Actor:</w:t>
+      </w:r>
+      <w:r>
+        <w:rPr>
+          <w:color w:val="000000" w:themeColor="text1"/>
+        </w:rPr>
+        <w:t xml:space="preserve"> Student</w:t>
+      </w:r>
+    </w:p>
+    <w:p>
+      <w:pPr>
+        <w:rPr>
+          <w:color w:val="000000" w:themeColor="text1"/>
+        </w:rPr>
+      </w:pPr>
+      <w:r>
+        <w:rPr>
+          <w:b/>
+          <w:bCs/>
+          <w:color w:val="000000" w:themeColor="text1"/>
+        </w:rPr>
+        <w:t>Scenario:</w:t>
+      </w:r>
+    </w:p>
+    <w:p>
+      <w:pPr>
+        <w:numPr>
+          <w:ilvl w:val="0"/>
+          <w:numId w:val="10"/>
+        </w:numPr>
+        <w:rPr>
+          <w:color w:val="000000" w:themeColor="text1"/>
+        </w:rPr>
+      </w:pPr>
+      <w:r>
+        <w:rPr>
+          <w:color w:val="000000" w:themeColor="text1"/>
+        </w:rPr>
+        <w:t>The student opens a lesson with an available transcript or text.</w:t>
+      </w:r>
+    </w:p>
+    <w:p>
+      <w:pPr>
+        <w:numPr>
+          <w:ilvl w:val="0"/>
+          <w:numId w:val="10"/>
+        </w:numPr>
+        <w:rPr>
+          <w:color w:val="000000" w:themeColor="text1"/>
+        </w:rPr>
+      </w:pPr>
+      <w:r>
+        <w:rPr>
+          <w:color w:val="000000" w:themeColor="text1"/>
+        </w:rPr>
+        <w:t>The student requests a summary.</w:t>
+      </w:r>
+    </w:p>
+    <w:p>
+      <w:pPr>
+        <w:numPr>
+          <w:ilvl w:val="0"/>
+          <w:numId w:val="10"/>
+        </w:numPr>
+        <w:rPr>
+          <w:color w:val="000000" w:themeColor="text1"/>
+        </w:rPr>
+      </w:pPr>
+      <w:r>
+        <w:rPr>
+          <w:color w:val="000000" w:themeColor="text1"/>
+        </w:rPr>
+        <w:t>The AI service generates a summary and key points.</w:t>
+      </w:r>
+    </w:p>
+    <w:p>
+      <w:pPr>
+        <w:numPr>
+          <w:ilvl w:val="0"/>
+          <w:numId w:val="10"/>
+        </w:numPr>
+        <w:rPr>
+          <w:color w:val="000000" w:themeColor="text1"/>
+        </w:rPr>
+      </w:pPr>
+      <w:r>
+        <w:rPr>
+          <w:color w:val="000000" w:themeColor="text1"/>
+        </w:rPr>
+        <w:t>The system displays the result.</w:t>
+      </w:r>
+    </w:p>
+    <w:p>
+      <w:pPr>
+        <w:rPr>
+          <w:color w:val="000000" w:themeColor="text1"/>
+        </w:rPr>
+      </w:pPr>
+      <w:r>
+        <w:rPr>
+          <w:b/>
+          <w:bCs/>
+          <w:color w:val="000000" w:themeColor="text1"/>
+        </w:rPr>
+        <w:t>Alternative:</w:t>
+      </w:r>
+      <w:r>
+        <w:rPr>
+          <w:color w:val="000000" w:themeColor="text1"/>
+        </w:rPr>
+        <w:t xml:space="preserve"> If the required content or AI service is unavailable, the system informs the student.</w:t>
+      </w:r>
+    </w:p>
+    <w:p>
+      <w:pPr>
+        <w:rPr>
+          <w:b/>
+          <w:bCs/>
+          <w:color w:val="000000" w:themeColor="text1"/>
+        </w:rPr>
+      </w:pPr>
+      <w:r>
+        <w:rPr>
+          <w:b/>
+          <w:bCs/>
+          <w:color w:val="000000" w:themeColor="text1"/>
+        </w:rPr>
+        <w:t>UC-09: AI Learning Assistant</w:t>
+      </w:r>
+    </w:p>
+    <w:p>
+      <w:pPr>
+        <w:rPr>
+          <w:color w:val="000000" w:themeColor="text1"/>
+        </w:rPr>
+      </w:pPr>
+      <w:r>
+        <w:rPr>
+          <w:b/>
+          <w:bCs/>
+          <w:color w:val="000000" w:themeColor="text1"/>
+        </w:rPr>
+        <w:t>Actor:</w:t>
+      </w:r>
+      <w:r>
+        <w:rPr>
+          <w:color w:val="000000" w:themeColor="text1"/>
+        </w:rPr>
+        <w:t xml:space="preserve"> Student</w:t>
+      </w:r>
+    </w:p>
+    <w:p>
+      <w:pPr>
+        <w:rPr>
+          <w:color w:val="000000" w:themeColor="text1"/>
+        </w:rPr>
+      </w:pPr>
+      <w:r>
+        <w:rPr>
+          <w:b/>
+          <w:bCs/>
+          <w:color w:val="000000" w:themeColor="text1"/>
+        </w:rPr>
+        <w:t>Scenario:</w:t>
+      </w:r>
+    </w:p>
+    <w:p>
+      <w:pPr>
+        <w:numPr>
+          <w:ilvl w:val="0"/>
+          <w:numId w:val="11"/>
+        </w:numPr>
+        <w:rPr>
+          <w:color w:val="000000" w:themeColor="text1"/>
+        </w:rPr>
+      </w:pPr>
+      <w:r>
+        <w:rPr>
+          <w:color w:val="000000" w:themeColor="text1"/>
+        </w:rPr>
+        <w:t>The student asks a question about course content.</w:t>
+      </w:r>
+    </w:p>
+    <w:p>
+      <w:pPr>
+        <w:numPr>
+          <w:ilvl w:val="0"/>
+          <w:numId w:val="11"/>
+        </w:numPr>
+        <w:rPr>
+          <w:color w:val="000000" w:themeColor="text1"/>
+        </w:rPr>
+      </w:pPr>
+      <w:r>
+        <w:rPr>
+          <w:color w:val="000000" w:themeColor="text1"/>
+        </w:rPr>
+        <w:t>The system retrieves relevant learning materials.</w:t>
+      </w:r>
+    </w:p>
+    <w:p>
+      <w:pPr>
+        <w:numPr>
+          <w:ilvl w:val="0"/>
+          <w:numId w:val="11"/>
+        </w:numPr>
+        <w:rPr>
+          <w:color w:val="000000" w:themeColor="text1"/>
+        </w:rPr>
+      </w:pPr>
+      <w:r>
+        <w:rPr>
+          <w:color w:val="000000" w:themeColor="text1"/>
+        </w:rPr>
+        <w:lastRenderedPageBreak/>
+        <w:t>The AI assistant generates an answer based on the available materials.</w:t>
+      </w:r>
+    </w:p>
+    <w:p>
+      <w:pPr>
+        <w:numPr>
+          <w:ilvl w:val="0"/>
+          <w:numId w:val="11"/>
+        </w:numPr>
+        <w:rPr>
+          <w:color w:val="000000" w:themeColor="text1"/>
+        </w:rPr>
+      </w:pPr>
+      <w:r>
+        <w:rPr>
+          <w:color w:val="000000" w:themeColor="text1"/>
+        </w:rPr>
+        <w:t>The system displays the answer.</w:t>
+      </w:r>
+    </w:p>
+    <w:p>
+      <w:pPr>
+        <w:rPr>
+          <w:color w:val="000000" w:themeColor="text1"/>
+        </w:rPr>
+      </w:pPr>
+      <w:r>
+        <w:rPr>
+          <w:b/>
+          <w:bCs/>
+          <w:color w:val="000000" w:themeColor="text1"/>
+        </w:rPr>
+        <w:t>Alternative:</w:t>
+      </w:r>
+      <w:r>
+        <w:rPr>
+          <w:color w:val="000000" w:themeColor="text1"/>
+        </w:rPr>
+        <w:t xml:space="preserve"> If relevant information is unavailable, the assistant explains that it cannot provide a reliable answer.</w:t>
+      </w:r>
+    </w:p>
+    <w:p>
+      <w:pPr>
+        <w:rPr>
+          <w:b/>
+          <w:bCs/>
+          <w:color w:val="000000" w:themeColor="text1"/>
+        </w:rPr>
+      </w:pPr>
+      <w:r>
+        <w:rPr>
+          <w:b/>
+          <w:bCs/>
+          <w:color w:val="000000" w:themeColor="text1"/>
+        </w:rPr>
+        <w:t>UC-10: AI Customer Support</w:t>
+      </w:r>
+    </w:p>
+    <w:p>
+      <w:pPr>
+        <w:rPr>
+          <w:color w:val="000000" w:themeColor="text1"/>
+        </w:rPr>
+      </w:pPr>
+      <w:r>
+        <w:rPr>
+          <w:b/>
+          <w:bCs/>
+          <w:color w:val="000000" w:themeColor="text1"/>
+        </w:rPr>
+        <w:t>Actor:</w:t>
+      </w:r>
+      <w:r>
+        <w:rPr>
+          <w:color w:val="000000" w:themeColor="text1"/>
+        </w:rPr>
+        <w:t xml:space="preserve"> Student, Instructor, Public Visitor</w:t>
+      </w:r>
+    </w:p>
+    <w:p>
+      <w:pPr>
+        <w:rPr>
+          <w:color w:val="000000" w:themeColor="text1"/>
+        </w:rPr>
+      </w:pPr>
+      <w:r>
+        <w:rPr>
+          <w:b/>
+          <w:bCs/>
+          <w:color w:val="000000" w:themeColor="text1"/>
+        </w:rPr>
+        <w:t>Scenario:</w:t>
+      </w:r>
+    </w:p>
+    <w:p>
+      <w:pPr>
+        <w:numPr>
+          <w:ilvl w:val="0"/>
+          <w:numId w:val="12"/>
+        </w:numPr>
+        <w:rPr>
+          <w:color w:val="000000" w:themeColor="text1"/>
+        </w:rPr>
+      </w:pPr>
+      <w:r>
+        <w:rPr>
+          <w:color w:val="000000" w:themeColor="text1"/>
+        </w:rPr>
+        <w:t>The user asks the chatbot about registration, payments, enrollment, certificates, or technical support.</w:t>
+      </w:r>
+    </w:p>
+    <w:p>
+      <w:pPr>
+        <w:numPr>
+          <w:ilvl w:val="0"/>
+          <w:numId w:val="12"/>
+        </w:numPr>
+        <w:rPr>
+          <w:color w:val="000000" w:themeColor="text1"/>
+        </w:rPr>
+      </w:pPr>
+      <w:r>
+        <w:rPr>
+          <w:color w:val="000000" w:themeColor="text1"/>
+        </w:rPr>
+        <w:t>The system retrieves relevant approved support information.</w:t>
+      </w:r>
+    </w:p>
+    <w:p>
+      <w:pPr>
+        <w:numPr>
+          <w:ilvl w:val="0"/>
+          <w:numId w:val="12"/>
+        </w:numPr>
+        <w:rPr>
+          <w:color w:val="000000" w:themeColor="text1"/>
+        </w:rPr>
+      </w:pPr>
+      <w:r>
+        <w:rPr>
+          <w:color w:val="000000" w:themeColor="text1"/>
+        </w:rPr>
+        <w:t>The AI chatbot generates and displays a response.</w:t>
+      </w:r>
+    </w:p>
+    <w:p>
+      <w:pPr>
+        <w:rPr>
+          <w:color w:val="000000" w:themeColor="text1"/>
+        </w:rPr>
+      </w:pPr>
+      <w:r>
+        <w:rPr>
+          <w:b/>
+          <w:bCs/>
+          <w:color w:val="000000" w:themeColor="text1"/>
+        </w:rPr>
+        <w:t>Alternative:</w:t>
+      </w:r>
+      <w:r>
+        <w:rPr>
+          <w:color w:val="000000" w:themeColor="text1"/>
+        </w:rPr>
+        <w:t xml:space="preserve"> If the chatbot cannot resolve the issue, it directs the user to an available support channel.</w:t>
+      </w:r>
+    </w:p>
+    <w:p>
+      <w:pPr>
+        <w:rPr>
+          <w:b/>
+          <w:bCs/>
+          <w:color w:val="000000" w:themeColor="text1"/>
+        </w:rPr>
+      </w:pPr>
+      <w:r>
+        <w:rPr>
+          <w:b/>
+          <w:bCs/>
+          <w:color w:val="000000" w:themeColor="text1"/>
+        </w:rPr>
+        <w:t>UC-11: Notifications and Announcements</w:t>
+      </w:r>
+    </w:p>
+    <w:p>
+      <w:pPr>
+        <w:rPr>
+          <w:color w:val="000000" w:themeColor="text1"/>
+        </w:rPr>
+      </w:pPr>
+      <w:r>
+        <w:rPr>
+          <w:b/>
+          <w:bCs/>
+          <w:color w:val="000000" w:themeColor="text1"/>
+        </w:rPr>
+        <w:t>Actors:</w:t>
+      </w:r>
+      <w:r>
+        <w:rPr>
+          <w:color w:val="000000" w:themeColor="text1"/>
+        </w:rPr>
+        <w:t xml:space="preserve"> Student, Instructor, Admin</w:t>
+      </w:r>
+    </w:p>
+    <w:p>
+      <w:pPr>
+        <w:rPr>
+          <w:color w:val="000000" w:themeColor="text1"/>
+        </w:rPr>
+      </w:pPr>
+      <w:r>
+        <w:rPr>
+          <w:b/>
+          <w:bCs/>
+          <w:color w:val="000000" w:themeColor="text1"/>
+        </w:rPr>
+        <w:t>Scenario:</w:t>
+      </w:r>
+    </w:p>
+    <w:p>
+      <w:pPr>
+        <w:numPr>
+          <w:ilvl w:val="0"/>
+          <w:numId w:val="13"/>
+        </w:numPr>
+        <w:rPr>
+          <w:color w:val="000000" w:themeColor="text1"/>
+        </w:rPr>
+      </w:pPr>
+      <w:r>
+        <w:rPr>
+          <w:color w:val="000000" w:themeColor="text1"/>
+        </w:rPr>
+        <w:t>An event occurs, such as enrollment, payment completion, or a learning milestone.</w:t>
+      </w:r>
+    </w:p>
+    <w:p>
+      <w:pPr>
+        <w:numPr>
+          <w:ilvl w:val="0"/>
+          <w:numId w:val="13"/>
+        </w:numPr>
+        <w:rPr>
+          <w:color w:val="000000" w:themeColor="text1"/>
+        </w:rPr>
+      </w:pPr>
+      <w:r>
+        <w:rPr>
+          <w:color w:val="000000" w:themeColor="text1"/>
+        </w:rPr>
+        <w:t>The system generates a notification for the relevant user.</w:t>
+      </w:r>
+    </w:p>
+    <w:p>
+      <w:pPr>
+        <w:numPr>
+          <w:ilvl w:val="0"/>
+          <w:numId w:val="13"/>
+        </w:numPr>
+        <w:rPr>
+          <w:color w:val="000000" w:themeColor="text1"/>
+        </w:rPr>
+      </w:pPr>
+      <w:r>
+        <w:rPr>
+          <w:color w:val="000000" w:themeColor="text1"/>
+        </w:rPr>
+        <w:t>Instructors can publish course announcements.</w:t>
+      </w:r>
+    </w:p>
+    <w:p>
+      <w:pPr>
+        <w:numPr>
+          <w:ilvl w:val="0"/>
+          <w:numId w:val="13"/>
+        </w:numPr>
+        <w:rPr>
+          <w:color w:val="000000" w:themeColor="text1"/>
+        </w:rPr>
+      </w:pPr>
+      <w:r>
+        <w:rPr>
+          <w:color w:val="000000" w:themeColor="text1"/>
+        </w:rPr>
+        <w:t>The system makes notifications and announcements available to their intended recipients.</w:t>
+      </w:r>
+    </w:p>
+    <w:p>
+      <w:pPr>
+        <w:rPr>
+          <w:color w:val="000000" w:themeColor="text1"/>
+        </w:rPr>
+      </w:pPr>
+      <w:r>
+        <w:rPr>
+          <w:b/>
+          <w:bCs/>
+          <w:color w:val="000000" w:themeColor="text1"/>
+        </w:rPr>
+        <w:t>Alternative:</w:t>
+      </w:r>
+      <w:r>
+        <w:rPr>
+          <w:color w:val="000000" w:themeColor="text1"/>
+        </w:rPr>
+        <w:t xml:space="preserve"> Failed notification delivery is handled according to the system's notification policy.</w:t>
+      </w:r>
+    </w:p>
+    <w:p>
+      <w:pPr>
+        <w:rPr>
+          <w:b/>
+          <w:bCs/>
+          <w:color w:val="000000" w:themeColor="text1"/>
+        </w:rPr>
+      </w:pPr>
+      <w:r>
+        <w:rPr>
+          <w:b/>
+          <w:bCs/>
+          <w:color w:val="000000" w:themeColor="text1"/>
+        </w:rPr>
+        <w:t>UC-12: Certificate Generation and Verification</w:t>
+      </w:r>
+    </w:p>
+    <w:p>
+      <w:pPr>
+        <w:rPr>
+          <w:color w:val="000000" w:themeColor="text1"/>
+        </w:rPr>
+      </w:pPr>
+      <w:r>
+        <w:rPr>
+          <w:b/>
+          <w:bCs/>
+          <w:color w:val="000000" w:themeColor="text1"/>
+        </w:rPr>
+        <w:t>Actors:</w:t>
+      </w:r>
+      <w:r>
+        <w:rPr>
+          <w:color w:val="000000" w:themeColor="text1"/>
+        </w:rPr>
+        <w:t xml:space="preserve"> Student, Public Visitor</w:t>
+      </w:r>
+    </w:p>
+    <w:p>
+      <w:pPr>
+        <w:rPr>
+          <w:color w:val="000000" w:themeColor="text1"/>
+        </w:rPr>
+      </w:pPr>
+      <w:r>
+        <w:rPr>
+          <w:b/>
+          <w:bCs/>
+          <w:color w:val="000000" w:themeColor="text1"/>
+        </w:rPr>
+        <w:t>Scenario:</w:t>
+      </w:r>
+    </w:p>
+    <w:p>
+      <w:pPr>
+        <w:numPr>
+          <w:ilvl w:val="0"/>
+          <w:numId w:val="14"/>
+        </w:numPr>
+        <w:rPr>
+          <w:color w:val="000000" w:themeColor="text1"/>
+        </w:rPr>
+      </w:pPr>
+      <w:r>
+        <w:rPr>
+          <w:color w:val="000000" w:themeColor="text1"/>
+        </w:rPr>
+        <w:t>The system verifies that the student has completed the course requirements.</w:t>
+      </w:r>
+    </w:p>
+    <w:p>
+      <w:pPr>
+        <w:numPr>
+          <w:ilvl w:val="0"/>
+          <w:numId w:val="14"/>
+        </w:numPr>
+        <w:rPr>
+          <w:color w:val="000000" w:themeColor="text1"/>
+        </w:rPr>
+      </w:pPr>
+      <w:r>
+        <w:rPr>
+          <w:color w:val="000000" w:themeColor="text1"/>
+        </w:rPr>
+        <w:lastRenderedPageBreak/>
+        <w:t>The system generates a personalized PDF certificate with a unique verification code.</w:t>
+      </w:r>
+    </w:p>
+    <w:p>
+      <w:pPr>
+        <w:numPr>
+          <w:ilvl w:val="0"/>
+          <w:numId w:val="14"/>
+        </w:numPr>
+        <w:rPr>
+          <w:color w:val="000000" w:themeColor="text1"/>
+        </w:rPr>
+      </w:pPr>
+      <w:r>
+        <w:rPr>
+          <w:color w:val="000000" w:themeColor="text1"/>
+        </w:rPr>
+        <w:t>The student downloads the certificate.</w:t>
+      </w:r>
+    </w:p>
+    <w:p>
+      <w:pPr>
+        <w:numPr>
+          <w:ilvl w:val="0"/>
+          <w:numId w:val="14"/>
+        </w:numPr>
+        <w:rPr>
+          <w:color w:val="000000" w:themeColor="text1"/>
+        </w:rPr>
+      </w:pPr>
+      <w:r>
+        <w:rPr>
+          <w:color w:val="000000" w:themeColor="text1"/>
+        </w:rPr>
+        <w:t>A visitor can verify its validity through the public verification page.</w:t>
+      </w:r>
+    </w:p>
+    <w:p>
+      <w:pPr>
+        <w:rPr>
+          <w:color w:val="000000" w:themeColor="text1"/>
+        </w:rPr>
+      </w:pPr>
+      <w:r>
+        <w:rPr>
+          <w:b/>
+          <w:bCs/>
+          <w:color w:val="000000" w:themeColor="text1"/>
+        </w:rPr>
+        <w:t>Alternative:</w:t>
+      </w:r>
+      <w:r>
+        <w:rPr>
+          <w:color w:val="000000" w:themeColor="text1"/>
+        </w:rPr>
+        <w:t xml:space="preserve"> The system denies certificate generation if the completion requirements are not met.</w:t>
+      </w:r>
+    </w:p>
+    <w:p>
+      <w:pPr>
+        <w:rPr>
+          <w:b/>
+          <w:bCs/>
+          <w:color w:val="000000" w:themeColor="text1"/>
+        </w:rPr>
+      </w:pPr>
+      <w:r>
+        <w:rPr>
+          <w:b/>
+          <w:bCs/>
+          <w:color w:val="000000" w:themeColor="text1"/>
+        </w:rPr>
+        <w:t>UC-13: Admin Management and Course Approval</w:t>
+      </w:r>
+    </w:p>
+    <w:p>
+      <w:pPr>
+        <w:rPr>
+          <w:color w:val="000000" w:themeColor="text1"/>
+        </w:rPr>
+      </w:pPr>
+      <w:r>
+        <w:rPr>
+          <w:b/>
+          <w:bCs/>
+          <w:color w:val="000000" w:themeColor="text1"/>
+        </w:rPr>
+        <w:t>Actor:</w:t>
+      </w:r>
+      <w:r>
+        <w:rPr>
+          <w:color w:val="000000" w:themeColor="text1"/>
+        </w:rPr>
+        <w:t xml:space="preserve"> Admin</w:t>
+      </w:r>
+    </w:p>
+    <w:p>
+      <w:pPr>
+        <w:rPr>
+          <w:color w:val="000000" w:themeColor="text1"/>
+        </w:rPr>
+      </w:pPr>
+      <w:r>
+        <w:rPr>
+          <w:b/>
+          <w:bCs/>
+          <w:color w:val="000000" w:themeColor="text1"/>
+        </w:rPr>
+        <w:t>Scenario:</w:t>
+      </w:r>
+    </w:p>
+    <w:p>
+      <w:pPr>
+        <w:numPr>
+          <w:ilvl w:val="0"/>
+          <w:numId w:val="15"/>
+        </w:numPr>
+        <w:rPr>
+          <w:color w:val="000000" w:themeColor="text1"/>
+        </w:rPr>
+      </w:pPr>
+      <w:r>
+        <w:rPr>
+          <w:color w:val="000000" w:themeColor="text1"/>
+        </w:rPr>
+        <w:t>The administrator manages users, roles, categories, and platform settings.</w:t>
+      </w:r>
+    </w:p>
+    <w:p>
+      <w:pPr>
+        <w:numPr>
+          <w:ilvl w:val="0"/>
+          <w:numId w:val="15"/>
+        </w:numPr>
+        <w:rPr>
+          <w:color w:val="000000" w:themeColor="text1"/>
+        </w:rPr>
+      </w:pPr>
+      <w:r>
+        <w:rPr>
+          <w:color w:val="000000" w:themeColor="text1"/>
+        </w:rPr>
+        <w:t>The administrator reviews submitted courses.</w:t>
+      </w:r>
+    </w:p>
+    <w:p>
+      <w:pPr>
+        <w:numPr>
+          <w:ilvl w:val="0"/>
+          <w:numId w:val="15"/>
+        </w:numPr>
+        <w:rPr>
+          <w:color w:val="000000" w:themeColor="text1"/>
+        </w:rPr>
+      </w:pPr>
+      <w:r>
+        <w:rPr>
+          <w:color w:val="000000" w:themeColor="text1"/>
+        </w:rPr>
+        <w:t>The administrator approves or rejects each course.</w:t>
+      </w:r>
+    </w:p>
+    <w:p>
+      <w:pPr>
+        <w:numPr>
+          <w:ilvl w:val="0"/>
+          <w:numId w:val="15"/>
+        </w:numPr>
+        <w:rPr>
+          <w:color w:val="000000" w:themeColor="text1"/>
+        </w:rPr>
+      </w:pPr>
+      <w:r>
+        <w:rPr>
+          <w:color w:val="000000" w:themeColor="text1"/>
+        </w:rPr>
+        <w:t>The system saves the changes and updates the course status.</w:t>
+      </w:r>
+    </w:p>
+    <w:p>
+      <w:pPr>
+        <w:rPr>
+          <w:color w:val="000000" w:themeColor="text1"/>
+        </w:rPr>
+      </w:pPr>
+      <w:r>
+        <w:rPr>
+          <w:b/>
+          <w:bCs/>
+          <w:color w:val="000000" w:themeColor="text1"/>
+        </w:rPr>
+        <w:t>Alternative:</w:t>
+      </w:r>
+      <w:r>
+        <w:rPr>
+          <w:color w:val="000000" w:themeColor="text1"/>
+        </w:rPr>
+        <w:t xml:space="preserve"> Rejected courses are returned to instructors for correction when appropriate.</w:t>
+      </w:r>
+    </w:p>
+    <w:p>
+      <w:pPr>
+        <w:rPr>
+          <w:b/>
+          <w:bCs/>
+          <w:color w:val="000000" w:themeColor="text1"/>
+        </w:rPr>
+      </w:pPr>
+      <w:r>
+        <w:rPr>
+          <w:b/>
+          <w:bCs/>
+          <w:color w:val="000000" w:themeColor="text1"/>
+        </w:rPr>
+        <w:t>UC-14: Analytics and Reporting</w:t>
+      </w:r>
+    </w:p>
+    <w:p>
+      <w:pPr>
+        <w:rPr>
+          <w:color w:val="000000" w:themeColor="text1"/>
+        </w:rPr>
+      </w:pPr>
+      <w:r>
+        <w:rPr>
+          <w:b/>
+          <w:bCs/>
+          <w:color w:val="000000" w:themeColor="text1"/>
+        </w:rPr>
+        <w:t>Actors:</w:t>
+      </w:r>
+      <w:r>
+        <w:rPr>
+          <w:color w:val="000000" w:themeColor="text1"/>
+        </w:rPr>
+        <w:t xml:space="preserve"> Admin, Instructor</w:t>
+      </w:r>
+    </w:p>
+    <w:p>
+      <w:pPr>
+        <w:rPr>
+          <w:color w:val="000000" w:themeColor="text1"/>
+        </w:rPr>
+      </w:pPr>
+      <w:r>
+        <w:rPr>
+          <w:b/>
+          <w:bCs/>
+          <w:color w:val="000000" w:themeColor="text1"/>
+        </w:rPr>
+        <w:t>Scenario:</w:t>
+      </w:r>
+    </w:p>
+    <w:p>
+      <w:pPr>
+        <w:numPr>
+          <w:ilvl w:val="0"/>
+          <w:numId w:val="16"/>
+        </w:numPr>
+        <w:rPr>
+          <w:color w:val="000000" w:themeColor="text1"/>
+        </w:rPr>
+      </w:pPr>
+      <w:r>
+        <w:rPr>
+          <w:color w:val="000000" w:themeColor="text1"/>
+        </w:rPr>
+        <w:t>The user opens the analytics dashboard.</w:t>
+      </w:r>
+    </w:p>
+    <w:p>
+      <w:pPr>
+        <w:numPr>
+          <w:ilvl w:val="0"/>
+          <w:numId w:val="16"/>
+        </w:numPr>
+        <w:rPr>
+          <w:color w:val="000000" w:themeColor="text1"/>
+        </w:rPr>
+      </w:pPr>
+      <w:r>
+        <w:rPr>
+          <w:color w:val="000000" w:themeColor="text1"/>
+        </w:rPr>
+        <w:t>The system retrieves relevant enrollment, completion, sales, and revenue data.</w:t>
+      </w:r>
+    </w:p>
+    <w:p>
+      <w:pPr>
+        <w:numPr>
+          <w:ilvl w:val="0"/>
+          <w:numId w:val="16"/>
+        </w:numPr>
+        <w:rPr>
+          <w:color w:val="000000" w:themeColor="text1"/>
+        </w:rPr>
+      </w:pPr>
+      <w:r>
+        <w:rPr>
+          <w:color w:val="000000" w:themeColor="text1"/>
+        </w:rPr>
+        <w:t>The system displays reports and charts according to the user's permissions.</w:t>
+      </w:r>
+    </w:p>
+    <w:p>
+      <w:pPr>
+        <w:rPr>
+          <w:color w:val="000000" w:themeColor="text1"/>
+        </w:rPr>
+      </w:pPr>
+      <w:r>
+        <w:rPr>
+          <w:b/>
+          <w:bCs/>
+          <w:color w:val="000000" w:themeColor="text1"/>
+        </w:rPr>
+        <w:t>Alternative:</w:t>
+      </w:r>
+      <w:r>
+        <w:rPr>
+          <w:color w:val="000000" w:themeColor="text1"/>
+        </w:rPr>
+        <w:t xml:space="preserve"> If no data is available, the system displays an empty report or zero values.</w:t>
+      </w:r>
+    </w:p>
+    <w:p>
+      <w:pPr>
+        <w:rPr>
+          <w:color w:val="000000" w:themeColor="text1"/>
+        </w:rPr>
+      </w:pPr>
+      <w:r>
+        <w:rPr>
+          <w:color w:val="000000" w:themeColor="text1"/>
+        </w:rPr>
+        <w:pict w14:anchorId="261B319B">
+          <v:rect id="_x0000_i1301" style="width:0;height:1.5pt" o:hralign="center" o:hrstd="t" o:hr="t" fillcolor="#a0a0a0" stroked="f"/>
+        </w:pict>
+      </w:r>
+    </w:p>
+    <w:p>
+      <w:pPr>
+        <w:rPr>
+          <w:b/>
+          <w:bCs/>
+          <w:color w:val="000000" w:themeColor="text1"/>
+        </w:rPr>
+      </w:pPr>
+      <w:r>
+        <w:rPr>
+          <w:b/>
+          <w:bCs/>
+          <w:color w:val="000000" w:themeColor="text1"/>
+        </w:rPr>
+        <w:t>Requirements Coverage</w:t>
+      </w:r>
+    </w:p>
+    <w:tbl>
+      <w:tblPr>
+        <w:tblW w:w="0" w:type="auto"/>
+        <w:tblCellSpacing w:w="15" w:type="dxa"/>
+        <w:tblCellMar>
+          <w:top w:w="15" w:type="dxa"/>
+          <w:left w:w="15" w:type="dxa"/>
+          <w:bottom w:w="15" w:type="dxa"/>
+          <w:right w:w="15" w:type="dxa"/>
+        </w:tblCellMar>
+        <w:tblLook w:val="04A0" w:firstRow="1" w:lastRow="0" w:firstColumn="1" w:lastColumn="0" w:noHBand="0" w:noVBand="1"/>
+      </w:tblPr>
+      <w:tblGrid>
+        <w:gridCol w:w="2836"/>
+        <w:gridCol w:w="1226"/>
+      </w:tblGrid>
+      <w:tr>
+        <w:trPr>
+          <w:tblHeader/>
+          <w:tblCellSpacing w:w="15" w:type="dxa"/>
+        </w:trPr>
+        <w:tc>
+          <w:tcPr>
+            <w:tcW w:w="0" w:type="auto"/>
+            <w:vAlign w:val="center"/>
+            <w:hideMark/>
+          </w:tcPr>
+          <w:p>
+            <w:pPr>
+              <w:rPr>
+                <w:b/>
+                <w:bCs/>
+                <w:color w:val="000000" w:themeColor="text1"/>
+              </w:rPr>
+            </w:pPr>
+            <w:r>
+              <w:rPr>
+                <w:b/>
+                <w:bCs/>
+                <w:color w:val="000000" w:themeColor="text1"/>
+              </w:rPr>
+              <w:t>Functional Requirements</w:t>
+            </w:r>
+          </w:p>
+        </w:tc>
+        <w:tc>
+          <w:tcPr>
+            <w:tcW w:w="0" w:type="auto"/>
+            <w:vAlign w:val="center"/>
+            <w:hideMark/>
+          </w:tcPr>
+          <w:p>
+            <w:pPr>
+              <w:rPr>
+                <w:b/>
+                <w:bCs/>
+                <w:color w:val="000000" w:themeColor="text1"/>
+              </w:rPr>
+            </w:pPr>
+            <w:r>
+              <w:rPr>
+                <w:b/>
+                <w:bCs/>
+                <w:color w:val="000000" w:themeColor="text1"/>
+              </w:rPr>
+              <w:t>Use Cases</w:t>
+            </w:r>
+          </w:p>
+        </w:tc>
+      </w:tr>
+      <w:tr>
+        <w:trPr>
+          <w:tblCellSpacing w:w="15" w:type="dxa"/>
+        </w:trPr>
+        <w:tc>
+          <w:tcPr>
+            <w:tcW w:w="0" w:type="auto"/>
+            <w:vAlign w:val="center"/>
+            <w:hideMark/>
+          </w:tcPr>
+          <w:p>
+            <w:pPr>
+              <w:rPr>
+                <w:color w:val="000000" w:themeColor="text1"/>
+              </w:rPr>
+            </w:pPr>
+            <w:r>
+              <w:rPr>
+                <w:color w:val="000000" w:themeColor="text1"/>
+              </w:rPr>
+              <w:t>FR-1</w:t>
+            </w:r>
+          </w:p>
+        </w:tc>
+        <w:tc>
+          <w:tcPr>
+            <w:tcW w:w="0" w:type="auto"/>
+            <w:vAlign w:val="center"/>
+            <w:hideMark/>
+          </w:tcPr>
+          <w:p>
+            <w:pPr>
+              <w:rPr>
+                <w:color w:val="000000" w:themeColor="text1"/>
+              </w:rPr>
+            </w:pPr>
+            <w:r>
+              <w:rPr>
+                <w:color w:val="000000" w:themeColor="text1"/>
+              </w:rPr>
+              <w:t>UC-01</w:t>
+            </w:r>
+          </w:p>
+        </w:tc>
+      </w:tr>
+      <w:tr>
+        <w:trPr>
+          <w:tblCellSpacing w:w="15" w:type="dxa"/>
+        </w:trPr>
+        <w:tc>
+          <w:tcPr>
+            <w:tcW w:w="0" w:type="auto"/>
+            <w:vAlign w:val="center"/>
+            <w:hideMark/>
+          </w:tcPr>
+          <w:p>
+            <w:pPr>
+              <w:rPr>
+                <w:color w:val="000000" w:themeColor="text1"/>
+              </w:rPr>
+            </w:pPr>
+            <w:r>
+              <w:rPr>
+                <w:color w:val="000000" w:themeColor="text1"/>
+              </w:rPr>
+              <w:t>FR-2</w:t>
+            </w:r>
+          </w:p>
+        </w:tc>
+        <w:tc>
+          <w:tcPr>
+            <w:tcW w:w="0" w:type="auto"/>
+            <w:vAlign w:val="center"/>
+            <w:hideMark/>
+          </w:tcPr>
+          <w:p>
+            <w:pPr>
+              <w:rPr>
+                <w:color w:val="000000" w:themeColor="text1"/>
+              </w:rPr>
+            </w:pPr>
+            <w:r>
+              <w:rPr>
+                <w:color w:val="000000" w:themeColor="text1"/>
+              </w:rPr>
+              <w:t>UC-02</w:t>
+            </w:r>
+          </w:p>
+        </w:tc>
+      </w:tr>
+      <w:tr>
+        <w:trPr>
+          <w:tblCellSpacing w:w="15" w:type="dxa"/>
+        </w:trPr>
+        <w:tc>
+          <w:tcPr>
+            <w:tcW w:w="0" w:type="auto"/>
+            <w:vAlign w:val="center"/>
+            <w:hideMark/>
+          </w:tcPr>
+          <w:p>
+            <w:pPr>
+              <w:rPr>
+                <w:color w:val="000000" w:themeColor="text1"/>
+              </w:rPr>
+            </w:pPr>
+            <w:r>
+              <w:rPr>
+                <w:color w:val="000000" w:themeColor="text1"/>
+              </w:rPr>
+              <w:lastRenderedPageBreak/>
+              <w:t>FR-3</w:t>
+            </w:r>
+          </w:p>
+        </w:tc>
+        <w:tc>
+          <w:tcPr>
+            <w:tcW w:w="0" w:type="auto"/>
+            <w:vAlign w:val="center"/>
+            <w:hideMark/>
+          </w:tcPr>
+          <w:p>
+            <w:pPr>
+              <w:rPr>
+                <w:color w:val="000000" w:themeColor="text1"/>
+              </w:rPr>
+            </w:pPr>
+            <w:r>
+              <w:rPr>
+                <w:color w:val="000000" w:themeColor="text1"/>
+              </w:rPr>
+              <w:t>UC-03</w:t>
+            </w:r>
+          </w:p>
+        </w:tc>
+      </w:tr>
+      <w:tr>
+        <w:trPr>
+          <w:tblCellSpacing w:w="15" w:type="dxa"/>
+        </w:trPr>
+        <w:tc>
+          <w:tcPr>
+            <w:tcW w:w="0" w:type="auto"/>
+            <w:vAlign w:val="center"/>
+            <w:hideMark/>
+          </w:tcPr>
+          <w:p>
+            <w:pPr>
+              <w:rPr>
+                <w:color w:val="000000" w:themeColor="text1"/>
+              </w:rPr>
+            </w:pPr>
+            <w:r>
+              <w:rPr>
+                <w:color w:val="000000" w:themeColor="text1"/>
+              </w:rPr>
+              <w:t>FR-4</w:t>
+            </w:r>
+          </w:p>
+        </w:tc>
+        <w:tc>
+          <w:tcPr>
+            <w:tcW w:w="0" w:type="auto"/>
+            <w:vAlign w:val="center"/>
+            <w:hideMark/>
+          </w:tcPr>
+          <w:p>
+            <w:pPr>
+              <w:rPr>
+                <w:color w:val="000000" w:themeColor="text1"/>
+              </w:rPr>
+            </w:pPr>
+            <w:r>
+              <w:rPr>
+                <w:color w:val="000000" w:themeColor="text1"/>
+              </w:rPr>
+              <w:t>UC-04</w:t>
+            </w:r>
+          </w:p>
+        </w:tc>
+      </w:tr>
+      <w:tr>
+        <w:trPr>
+          <w:tblCellSpacing w:w="15" w:type="dxa"/>
+        </w:trPr>
+        <w:tc>
+          <w:tcPr>
+            <w:tcW w:w="0" w:type="auto"/>
+            <w:vAlign w:val="center"/>
+            <w:hideMark/>
+          </w:tcPr>
+          <w:p>
+            <w:pPr>
+              <w:rPr>
+                <w:color w:val="000000" w:themeColor="text1"/>
+              </w:rPr>
+            </w:pPr>
+            <w:r>
+              <w:rPr>
+                <w:color w:val="000000" w:themeColor="text1"/>
+              </w:rPr>
+              <w:t>FR-5</w:t>
+            </w:r>
+          </w:p>
+        </w:tc>
+        <w:tc>
+          <w:tcPr>
+            <w:tcW w:w="0" w:type="auto"/>
+            <w:vAlign w:val="center"/>
+            <w:hideMark/>
+          </w:tcPr>
+          <w:p>
+            <w:pPr>
+              <w:rPr>
+                <w:color w:val="000000" w:themeColor="text1"/>
+              </w:rPr>
+            </w:pPr>
+            <w:r>
+              <w:rPr>
+                <w:color w:val="000000" w:themeColor="text1"/>
+              </w:rPr>
+              <w:t>UC-05</w:t>
+            </w:r>
+          </w:p>
+        </w:tc>
+      </w:tr>
+      <w:tr>
+        <w:trPr>
+          <w:tblCellSpacing w:w="15" w:type="dxa"/>
+        </w:trPr>
+        <w:tc>
+          <w:tcPr>
+            <w:tcW w:w="0" w:type="auto"/>
+            <w:vAlign w:val="center"/>
+            <w:hideMark/>
+          </w:tcPr>
+          <w:p>
+            <w:pPr>
+              <w:rPr>
+                <w:color w:val="000000" w:themeColor="text1"/>
+              </w:rPr>
+            </w:pPr>
+            <w:r>
+              <w:rPr>
+                <w:color w:val="000000" w:themeColor="text1"/>
+              </w:rPr>
+              <w:t>FR-6, FR-7</w:t>
+            </w:r>
+          </w:p>
+        </w:tc>
+        <w:tc>
+          <w:tcPr>
+            <w:tcW w:w="0" w:type="auto"/>
+            <w:vAlign w:val="center"/>
+            <w:hideMark/>
+          </w:tcPr>
+          <w:p>
+            <w:pPr>
+              <w:rPr>
+                <w:color w:val="000000" w:themeColor="text1"/>
+              </w:rPr>
+            </w:pPr>
+            <w:r>
+              <w:rPr>
+                <w:color w:val="000000" w:themeColor="text1"/>
+              </w:rPr>
+              <w:t>UC-06</w:t>
+            </w:r>
+          </w:p>
+        </w:tc>
+      </w:tr>
+      <w:tr>
+        <w:trPr>
+          <w:tblCellSpacing w:w="15" w:type="dxa"/>
+        </w:trPr>
+        <w:tc>
+          <w:tcPr>
+            <w:tcW w:w="0" w:type="auto"/>
+            <w:vAlign w:val="center"/>
+            <w:hideMark/>
+          </w:tcPr>
+          <w:p>
+            <w:pPr>
+              <w:rPr>
+                <w:color w:val="000000" w:themeColor="text1"/>
+              </w:rPr>
+            </w:pPr>
+            <w:r>
+              <w:rPr>
+                <w:color w:val="000000" w:themeColor="text1"/>
+              </w:rPr>
+              <w:t>FR-8</w:t>
+            </w:r>
+          </w:p>
+        </w:tc>
+        <w:tc>
+          <w:tcPr>
+            <w:tcW w:w="0" w:type="auto"/>
+            <w:vAlign w:val="center"/>
+            <w:hideMark/>
+          </w:tcPr>
+          <w:p>
+            <w:pPr>
+              <w:rPr>
+                <w:color w:val="000000" w:themeColor="text1"/>
+              </w:rPr>
+            </w:pPr>
+            <w:r>
+              <w:rPr>
+                <w:color w:val="000000" w:themeColor="text1"/>
+              </w:rPr>
+              <w:t>UC-07</w:t>
+            </w:r>
+          </w:p>
+        </w:tc>
+      </w:tr>
+      <w:tr>
+        <w:trPr>
+          <w:tblCellSpacing w:w="15" w:type="dxa"/>
+        </w:trPr>
+        <w:tc>
+          <w:tcPr>
+            <w:tcW w:w="0" w:type="auto"/>
+            <w:vAlign w:val="center"/>
+            <w:hideMark/>
+          </w:tcPr>
+          <w:p>
+            <w:pPr>
+              <w:rPr>
+                <w:color w:val="000000" w:themeColor="text1"/>
+              </w:rPr>
+            </w:pPr>
+            <w:r>
+              <w:rPr>
+                <w:color w:val="000000" w:themeColor="text1"/>
+              </w:rPr>
+              <w:t>FR-9</w:t>
+            </w:r>
+          </w:p>
+        </w:tc>
+        <w:tc>
+          <w:tcPr>
+            <w:tcW w:w="0" w:type="auto"/>
+            <w:vAlign w:val="center"/>
+            <w:hideMark/>
+          </w:tcPr>
+          <w:p>
+            <w:pPr>
+              <w:rPr>
+                <w:color w:val="000000" w:themeColor="text1"/>
+              </w:rPr>
+            </w:pPr>
+            <w:r>
+              <w:rPr>
+                <w:color w:val="000000" w:themeColor="text1"/>
+              </w:rPr>
+              <w:t>UC-08</w:t>
+            </w:r>
+          </w:p>
+        </w:tc>
+      </w:tr>
+      <w:tr>
+        <w:trPr>
+          <w:tblCellSpacing w:w="15" w:type="dxa"/>
+        </w:trPr>
+        <w:tc>
+          <w:tcPr>
+            <w:tcW w:w="0" w:type="auto"/>
+            <w:vAlign w:val="center"/>
+            <w:hideMark/>
+          </w:tcPr>
+          <w:p>
+            <w:pPr>
+              <w:rPr>
+                <w:color w:val="000000" w:themeColor="text1"/>
+              </w:rPr>
+            </w:pPr>
+            <w:r>
+              <w:rPr>
+                <w:color w:val="000000" w:themeColor="text1"/>
+              </w:rPr>
+              <w:t>FR-10</w:t>
+            </w:r>
+          </w:p>
+        </w:tc>
+        <w:tc>
+          <w:tcPr>
+            <w:tcW w:w="0" w:type="auto"/>
+            <w:vAlign w:val="center"/>
+            <w:hideMark/>
+          </w:tcPr>
+          <w:p>
+            <w:pPr>
+              <w:rPr>
+                <w:color w:val="000000" w:themeColor="text1"/>
+              </w:rPr>
+            </w:pPr>
+            <w:r>
+              <w:rPr>
+                <w:color w:val="000000" w:themeColor="text1"/>
+              </w:rPr>
+              <w:t>UC-09</w:t>
+            </w:r>
+          </w:p>
+        </w:tc>
+      </w:tr>
+      <w:tr>
+        <w:trPr>
+          <w:tblCellSpacing w:w="15" w:type="dxa"/>
+        </w:trPr>
+        <w:tc>
+          <w:tcPr>
+            <w:tcW w:w="0" w:type="auto"/>
+            <w:vAlign w:val="center"/>
+            <w:hideMark/>
+          </w:tcPr>
+          <w:p>
+            <w:pPr>
+              <w:rPr>
+                <w:color w:val="000000" w:themeColor="text1"/>
+              </w:rPr>
+            </w:pPr>
+            <w:r>
+              <w:rPr>
+                <w:color w:val="000000" w:themeColor="text1"/>
+              </w:rPr>
+              <w:t>FR-11</w:t>
+            </w:r>
+          </w:p>
+        </w:tc>
+        <w:tc>
+          <w:tcPr>
+            <w:tcW w:w="0" w:type="auto"/>
+            <w:vAlign w:val="center"/>
+            <w:hideMark/>
+          </w:tcPr>
+          <w:p>
+            <w:pPr>
+              <w:rPr>
+                <w:color w:val="000000" w:themeColor="text1"/>
+              </w:rPr>
+            </w:pPr>
+            <w:r>
+              <w:rPr>
+                <w:color w:val="000000" w:themeColor="text1"/>
+              </w:rPr>
+              <w:t>UC-10</w:t>
+            </w:r>
+          </w:p>
+        </w:tc>
+      </w:tr>
+      <w:tr>
+        <w:trPr>
+          <w:tblCellSpacing w:w="15" w:type="dxa"/>
+        </w:trPr>
+        <w:tc>
+          <w:tcPr>
+            <w:tcW w:w="0" w:type="auto"/>
+            <w:vAlign w:val="center"/>
+            <w:hideMark/>
+          </w:tcPr>
+          <w:p>
+            <w:pPr>
+              <w:rPr>
+                <w:color w:val="000000" w:themeColor="text1"/>
+              </w:rPr>
+            </w:pPr>
+            <w:r>
+              <w:rPr>
+                <w:color w:val="000000" w:themeColor="text1"/>
+              </w:rPr>
+              <w:t>FR-12</w:t>
+            </w:r>
+          </w:p>
+        </w:tc>
+        <w:tc>
+          <w:tcPr>
+            <w:tcW w:w="0" w:type="auto"/>
+            <w:vAlign w:val="center"/>
+            <w:hideMark/>
+          </w:tcPr>
+          <w:p>
+            <w:pPr>
+              <w:rPr>
+                <w:color w:val="000000" w:themeColor="text1"/>
+              </w:rPr>
+            </w:pPr>
+            <w:r>
+              <w:rPr>
+                <w:color w:val="000000" w:themeColor="text1"/>
+              </w:rPr>
+              <w:t>UC-11</w:t>
+            </w:r>
+          </w:p>
+        </w:tc>
+      </w:tr>
+      <w:tr>
+        <w:trPr>
+          <w:tblCellSpacing w:w="15" w:type="dxa"/>
+        </w:trPr>
+        <w:tc>
+          <w:tcPr>
+            <w:tcW w:w="0" w:type="auto"/>
+            <w:vAlign w:val="center"/>
+            <w:hideMark/>
+          </w:tcPr>
+          <w:p>
+            <w:pPr>
+              <w:rPr>
+                <w:color w:val="000000" w:themeColor="text1"/>
+              </w:rPr>
+            </w:pPr>
+            <w:r>
+              <w:rPr>
+                <w:color w:val="000000" w:themeColor="text1"/>
+              </w:rPr>
+              <w:t>FR-13</w:t>
+            </w:r>
+          </w:p>
+        </w:tc>
+        <w:tc>
+          <w:tcPr>
+            <w:tcW w:w="0" w:type="auto"/>
+            <w:vAlign w:val="center"/>
+            <w:hideMark/>
+          </w:tcPr>
+          <w:p>
+            <w:pPr>
+              <w:rPr>
+                <w:color w:val="000000" w:themeColor="text1"/>
+              </w:rPr>
+            </w:pPr>
+            <w:r>
+              <w:rPr>
+                <w:color w:val="000000" w:themeColor="text1"/>
+              </w:rPr>
+              <w:t>UC-12</w:t>
+            </w:r>
+          </w:p>
+        </w:tc>
+      </w:tr>
+      <w:tr>
+        <w:trPr>
+          <w:tblCellSpacing w:w="15" w:type="dxa"/>
+        </w:trPr>
+        <w:tc>
+          <w:tcPr>
+            <w:tcW w:w="0" w:type="auto"/>
+            <w:vAlign w:val="center"/>
+            <w:hideMark/>
+          </w:tcPr>
+          <w:p>
+            <w:pPr>
+              <w:rPr>
+                <w:color w:val="000000" w:themeColor="text1"/>
+              </w:rPr>
+            </w:pPr>
+            <w:r>
+              <w:rPr>
+                <w:color w:val="000000" w:themeColor="text1"/>
+              </w:rPr>
+              <w:t>FR-14</w:t>
+            </w:r>
+          </w:p>
+        </w:tc>
+        <w:tc>
+          <w:tcPr>
+            <w:tcW w:w="0" w:type="auto"/>
+            <w:vAlign w:val="center"/>
+            <w:hideMark/>
+          </w:tcPr>
+          <w:p>
+            <w:pPr>
+              <w:rPr>
+                <w:color w:val="000000" w:themeColor="text1"/>
+              </w:rPr>
+            </w:pPr>
+            <w:r>
+              <w:rPr>
+                <w:color w:val="000000" w:themeColor="text1"/>
+              </w:rPr>
+              <w:t>UC-13</w:t>
+            </w:r>
+          </w:p>
+        </w:tc>
+      </w:tr>
+      <w:tr>
+        <w:trPr>
+          <w:tblCellSpacing w:w="15" w:type="dxa"/>
+        </w:trPr>
+        <w:tc>
+          <w:tcPr>
+            <w:tcW w:w="0" w:type="auto"/>
+            <w:vAlign w:val="center"/>
+            <w:hideMark/>
+          </w:tcPr>
+          <w:p>
+            <w:pPr>
+              <w:rPr>
+                <w:color w:val="000000" w:themeColor="text1"/>
+              </w:rPr>
+            </w:pPr>
+            <w:r>
+              <w:rPr>
+                <w:color w:val="000000" w:themeColor="text1"/>
+              </w:rPr>
+              <w:t>FR-15</w:t>
+            </w:r>
+          </w:p>
+        </w:tc>
+        <w:tc>
+          <w:tcPr>
+            <w:tcW w:w="0" w:type="auto"/>
+            <w:vAlign w:val="center"/>
+            <w:hideMark/>
+          </w:tcPr>
+          <w:p>
+            <w:pPr>
+              <w:rPr>
+                <w:color w:val="000000" w:themeColor="text1"/>
+              </w:rPr>
+            </w:pPr>
+            <w:r>
+              <w:rPr>
+                <w:color w:val="000000" w:themeColor="text1"/>
+              </w:rPr>
+              <w:t>UC-14</w:t>
+            </w:r>
+          </w:p>
+        </w:tc>
+      </w:tr>
+    </w:tbl>
     <w:p>
       <w:pPr>
         <w:rPr>
@@ -537,6 +3341,1023 @@
 <file path=word/numbering.xml><?xml version="1.0" encoding="utf-8"?>
 <w:numbering xmlns:wpc="http://schemas.microsoft.com/office/word/2010/wordprocessingCanvas" xmlns:cx="http://schemas.microsoft.com/office/drawing/2014/chartex" xmlns:cx1="http://schemas.microsoft.com/office/drawing/2015/9/8/chartex" xmlns:cx2="http://schemas.microsoft.com/office/drawing/2015/10/21/chartex" xmlns:cx3="http://schemas.microsoft.com/office/drawing/2016/5/9/chartex" xmlns:cx4="http://schemas.microsoft.com/office/drawing/2016/5/10/chartex" xmlns:cx5="http://schemas.microsoft.com/office/drawing/2016/5/11/chartex" xmlns:cx6="http://schemas.microsoft.com/office/drawing/2016/5/12/chartex" xmlns:cx7="http://schemas.microsoft.com/office/drawing/2016/5/13/chartex" xmlns:cx8="http://schemas.microsoft.com/office/drawing/2016/5/14/chartex" xmlns:mc="http://schemas.openxmlformats.org/markup-compatibility/2006" xmlns:aink="http://schemas.microsoft.com/office/drawing/2016/ink" xmlns:am3d="http://schemas.microsoft.com/office/drawing/2017/model3d" xmlns:o="urn:schemas-microsoft-com:office:office" xmlns:oel="http://schemas.microsoft.com/office/2019/extlst" xmlns:r="http://schemas.openxmlformats.org/officeDocument/2006/relationships" xmlns:m="http://schemas.openxmlformats.org/officeDocument/2006/math" xmlns:v="urn:schemas-microsoft-com:vml" xmlns:wp14="http://schemas.microsoft.com/office/word/2010/wordprocessingDrawing" xmlns:wp="http://schemas.openxmlformats.org/drawingml/2006/wordprocessingDrawing" xmlns:w10="urn:schemas-microsoft-com:office:word" xmlns:w="http://schemas.openxmlformats.org/wordprocessingml/2006/main" xmlns:w14="http://schemas.microsoft.com/office/word/2010/wordml" xmlns:w15="http://schemas.microsoft.com/office/word/2012/wordml" xmlns:w16cex="http://schemas.microsoft.com/office/word/2018/wordml/cex" xmlns:w16cid="http://schemas.microsoft.com/office/word/2016/wordml/cid" xmlns:w16="http://schemas.microsoft.com/office/word/2018/wordml" xmlns:w16du="http://schemas.microsoft.com/office/word/2023/wordml/word16du" xmlns:w16sdtdh="http://schemas.microsoft.com/office/word/2020/wordml/sdtdatahash" xmlns:w16sdtfl="http://schemas.microsoft.com/office/word/2024/wordml/sdtformatlock" xmlns:w16se="http://schemas.microsoft.com/office/word/2015/wordml/symex" xmlns:wpg="http://schemas.microsoft.com/office/word/2010/wordprocessingGroup" xmlns:wpi="http://schemas.microsoft.com/office/word/2010/wordprocessingInk" xmlns:wne="http://schemas.microsoft.com/office/word/2006/wordml" xmlns:wps="http://schemas.microsoft.com/office/word/2010/wordprocessingShape" mc:Ignorable="w14 w15 w16se w16cid w16 w16cex w16sdtdh w16sdtfl w16du wp14">
   <w:abstractNum w:abstractNumId="0" w15:restartNumberingAfterBreak="0">
+    <w:nsid w:val="0ACF4CC3"/>
+    <w:multiLevelType w:val="multilevel"/>
+    <w:tmpl w:val="2E9461BC"/>
+    <w:lvl w:ilvl="0">
+      <w:start w:val="1"/>
+      <w:numFmt w:val="decimal"/>
+      <w:lvlText w:val="%1."/>
+      <w:lvlJc w:val="left"/>
+      <w:pPr>
+        <w:tabs>
+          <w:tab w:val="num" w:pos="720"/>
+        </w:tabs>
+        <w:ind w:left="720" w:hanging="360"/>
+      </w:pPr>
+    </w:lvl>
+    <w:lvl w:ilvl="1" w:tentative="1">
+      <w:start w:val="1"/>
+      <w:numFmt w:val="decimal"/>
+      <w:lvlText w:val="%2."/>
+      <w:lvlJc w:val="left"/>
+      <w:pPr>
+        <w:tabs>
+          <w:tab w:val="num" w:pos="1440"/>
+        </w:tabs>
+        <w:ind w:left="1440" w:hanging="360"/>
+      </w:pPr>
+    </w:lvl>
+    <w:lvl w:ilvl="2" w:tentative="1">
+      <w:start w:val="1"/>
+      <w:numFmt w:val="decimal"/>
+      <w:lvlText w:val="%3."/>
+      <w:lvlJc w:val="left"/>
+      <w:pPr>
+        <w:tabs>
+          <w:tab w:val="num" w:pos="2160"/>
+        </w:tabs>
+        <w:ind w:left="2160" w:hanging="360"/>
+      </w:pPr>
+    </w:lvl>
+    <w:lvl w:ilvl="3" w:tentative="1">
+      <w:start w:val="1"/>
+      <w:numFmt w:val="decimal"/>
+      <w:lvlText w:val="%4."/>
+      <w:lvlJc w:val="left"/>
+      <w:pPr>
+        <w:tabs>
+          <w:tab w:val="num" w:pos="2880"/>
+        </w:tabs>
+        <w:ind w:left="2880" w:hanging="360"/>
+      </w:pPr>
+    </w:lvl>
+    <w:lvl w:ilvl="4" w:tentative="1">
+      <w:start w:val="1"/>
+      <w:numFmt w:val="decimal"/>
+      <w:lvlText w:val="%5."/>
+      <w:lvlJc w:val="left"/>
+      <w:pPr>
+        <w:tabs>
+          <w:tab w:val="num" w:pos="3600"/>
+        </w:tabs>
+        <w:ind w:left="3600" w:hanging="360"/>
+      </w:pPr>
+    </w:lvl>
+    <w:lvl w:ilvl="5" w:tentative="1">
+      <w:start w:val="1"/>
+      <w:numFmt w:val="decimal"/>
+      <w:lvlText w:val="%6."/>
+      <w:lvlJc w:val="left"/>
+      <w:pPr>
+        <w:tabs>
+          <w:tab w:val="num" w:pos="4320"/>
+        </w:tabs>
+        <w:ind w:left="4320" w:hanging="360"/>
+      </w:pPr>
+    </w:lvl>
+    <w:lvl w:ilvl="6" w:tentative="1">
+      <w:start w:val="1"/>
+      <w:numFmt w:val="decimal"/>
+      <w:lvlText w:val="%7."/>
+      <w:lvlJc w:val="left"/>
+      <w:pPr>
+        <w:tabs>
+          <w:tab w:val="num" w:pos="5040"/>
+        </w:tabs>
+        <w:ind w:left="5040" w:hanging="360"/>
+      </w:pPr>
+    </w:lvl>
+    <w:lvl w:ilvl="7" w:tentative="1">
+      <w:start w:val="1"/>
+      <w:numFmt w:val="decimal"/>
+      <w:lvlText w:val="%8."/>
+      <w:lvlJc w:val="left"/>
+      <w:pPr>
+        <w:tabs>
+          <w:tab w:val="num" w:pos="5760"/>
+        </w:tabs>
+        <w:ind w:left="5760" w:hanging="360"/>
+      </w:pPr>
+    </w:lvl>
+    <w:lvl w:ilvl="8" w:tentative="1">
+      <w:start w:val="1"/>
+      <w:numFmt w:val="decimal"/>
+      <w:lvlText w:val="%9."/>
+      <w:lvlJc w:val="left"/>
+      <w:pPr>
+        <w:tabs>
+          <w:tab w:val="num" w:pos="6480"/>
+        </w:tabs>
+        <w:ind w:left="6480" w:hanging="360"/>
+      </w:pPr>
+    </w:lvl>
+  </w:abstractNum>
+  <w:abstractNum w:abstractNumId="1" w15:restartNumberingAfterBreak="0">
+    <w:nsid w:val="18D54AD9"/>
+    <w:multiLevelType w:val="multilevel"/>
+    <w:tmpl w:val="772072B4"/>
+    <w:lvl w:ilvl="0">
+      <w:start w:val="1"/>
+      <w:numFmt w:val="decimal"/>
+      <w:lvlText w:val="%1."/>
+      <w:lvlJc w:val="left"/>
+      <w:pPr>
+        <w:tabs>
+          <w:tab w:val="num" w:pos="720"/>
+        </w:tabs>
+        <w:ind w:left="720" w:hanging="360"/>
+      </w:pPr>
+    </w:lvl>
+    <w:lvl w:ilvl="1" w:tentative="1">
+      <w:start w:val="1"/>
+      <w:numFmt w:val="decimal"/>
+      <w:lvlText w:val="%2."/>
+      <w:lvlJc w:val="left"/>
+      <w:pPr>
+        <w:tabs>
+          <w:tab w:val="num" w:pos="1440"/>
+        </w:tabs>
+        <w:ind w:left="1440" w:hanging="360"/>
+      </w:pPr>
+    </w:lvl>
+    <w:lvl w:ilvl="2" w:tentative="1">
+      <w:start w:val="1"/>
+      <w:numFmt w:val="decimal"/>
+      <w:lvlText w:val="%3."/>
+      <w:lvlJc w:val="left"/>
+      <w:pPr>
+        <w:tabs>
+          <w:tab w:val="num" w:pos="2160"/>
+        </w:tabs>
+        <w:ind w:left="2160" w:hanging="360"/>
+      </w:pPr>
+    </w:lvl>
+    <w:lvl w:ilvl="3" w:tentative="1">
+      <w:start w:val="1"/>
+      <w:numFmt w:val="decimal"/>
+      <w:lvlText w:val="%4."/>
+      <w:lvlJc w:val="left"/>
+      <w:pPr>
+        <w:tabs>
+          <w:tab w:val="num" w:pos="2880"/>
+        </w:tabs>
+        <w:ind w:left="2880" w:hanging="360"/>
+      </w:pPr>
+    </w:lvl>
+    <w:lvl w:ilvl="4" w:tentative="1">
+      <w:start w:val="1"/>
+      <w:numFmt w:val="decimal"/>
+      <w:lvlText w:val="%5."/>
+      <w:lvlJc w:val="left"/>
+      <w:pPr>
+        <w:tabs>
+          <w:tab w:val="num" w:pos="3600"/>
+        </w:tabs>
+        <w:ind w:left="3600" w:hanging="360"/>
+      </w:pPr>
+    </w:lvl>
+    <w:lvl w:ilvl="5" w:tentative="1">
+      <w:start w:val="1"/>
+      <w:numFmt w:val="decimal"/>
+      <w:lvlText w:val="%6."/>
+      <w:lvlJc w:val="left"/>
+      <w:pPr>
+        <w:tabs>
+          <w:tab w:val="num" w:pos="4320"/>
+        </w:tabs>
+        <w:ind w:left="4320" w:hanging="360"/>
+      </w:pPr>
+    </w:lvl>
+    <w:lvl w:ilvl="6" w:tentative="1">
+      <w:start w:val="1"/>
+      <w:numFmt w:val="decimal"/>
+      <w:lvlText w:val="%7."/>
+      <w:lvlJc w:val="left"/>
+      <w:pPr>
+        <w:tabs>
+          <w:tab w:val="num" w:pos="5040"/>
+        </w:tabs>
+        <w:ind w:left="5040" w:hanging="360"/>
+      </w:pPr>
+    </w:lvl>
+    <w:lvl w:ilvl="7" w:tentative="1">
+      <w:start w:val="1"/>
+      <w:numFmt w:val="decimal"/>
+      <w:lvlText w:val="%8."/>
+      <w:lvlJc w:val="left"/>
+      <w:pPr>
+        <w:tabs>
+          <w:tab w:val="num" w:pos="5760"/>
+        </w:tabs>
+        <w:ind w:left="5760" w:hanging="360"/>
+      </w:pPr>
+    </w:lvl>
+    <w:lvl w:ilvl="8" w:tentative="1">
+      <w:start w:val="1"/>
+      <w:numFmt w:val="decimal"/>
+      <w:lvlText w:val="%9."/>
+      <w:lvlJc w:val="left"/>
+      <w:pPr>
+        <w:tabs>
+          <w:tab w:val="num" w:pos="6480"/>
+        </w:tabs>
+        <w:ind w:left="6480" w:hanging="360"/>
+      </w:pPr>
+    </w:lvl>
+  </w:abstractNum>
+  <w:abstractNum w:abstractNumId="2" w15:restartNumberingAfterBreak="0">
+    <w:nsid w:val="1BFF35C0"/>
+    <w:multiLevelType w:val="multilevel"/>
+    <w:tmpl w:val="91A01050"/>
+    <w:lvl w:ilvl="0">
+      <w:start w:val="1"/>
+      <w:numFmt w:val="decimal"/>
+      <w:lvlText w:val="%1."/>
+      <w:lvlJc w:val="left"/>
+      <w:pPr>
+        <w:tabs>
+          <w:tab w:val="num" w:pos="720"/>
+        </w:tabs>
+        <w:ind w:left="720" w:hanging="360"/>
+      </w:pPr>
+    </w:lvl>
+    <w:lvl w:ilvl="1" w:tentative="1">
+      <w:start w:val="1"/>
+      <w:numFmt w:val="decimal"/>
+      <w:lvlText w:val="%2."/>
+      <w:lvlJc w:val="left"/>
+      <w:pPr>
+        <w:tabs>
+          <w:tab w:val="num" w:pos="1440"/>
+        </w:tabs>
+        <w:ind w:left="1440" w:hanging="360"/>
+      </w:pPr>
+    </w:lvl>
+    <w:lvl w:ilvl="2" w:tentative="1">
+      <w:start w:val="1"/>
+      <w:numFmt w:val="decimal"/>
+      <w:lvlText w:val="%3."/>
+      <w:lvlJc w:val="left"/>
+      <w:pPr>
+        <w:tabs>
+          <w:tab w:val="num" w:pos="2160"/>
+        </w:tabs>
+        <w:ind w:left="2160" w:hanging="360"/>
+      </w:pPr>
+    </w:lvl>
+    <w:lvl w:ilvl="3" w:tentative="1">
+      <w:start w:val="1"/>
+      <w:numFmt w:val="decimal"/>
+      <w:lvlText w:val="%4."/>
+      <w:lvlJc w:val="left"/>
+      <w:pPr>
+        <w:tabs>
+          <w:tab w:val="num" w:pos="2880"/>
+        </w:tabs>
+        <w:ind w:left="2880" w:hanging="360"/>
+      </w:pPr>
+    </w:lvl>
+    <w:lvl w:ilvl="4" w:tentative="1">
+      <w:start w:val="1"/>
+      <w:numFmt w:val="decimal"/>
+      <w:lvlText w:val="%5."/>
+      <w:lvlJc w:val="left"/>
+      <w:pPr>
+        <w:tabs>
+          <w:tab w:val="num" w:pos="3600"/>
+        </w:tabs>
+        <w:ind w:left="3600" w:hanging="360"/>
+      </w:pPr>
+    </w:lvl>
+    <w:lvl w:ilvl="5" w:tentative="1">
+      <w:start w:val="1"/>
+      <w:numFmt w:val="decimal"/>
+      <w:lvlText w:val="%6."/>
+      <w:lvlJc w:val="left"/>
+      <w:pPr>
+        <w:tabs>
+          <w:tab w:val="num" w:pos="4320"/>
+        </w:tabs>
+        <w:ind w:left="4320" w:hanging="360"/>
+      </w:pPr>
+    </w:lvl>
+    <w:lvl w:ilvl="6" w:tentative="1">
+      <w:start w:val="1"/>
+      <w:numFmt w:val="decimal"/>
+      <w:lvlText w:val="%7."/>
+      <w:lvlJc w:val="left"/>
+      <w:pPr>
+        <w:tabs>
+          <w:tab w:val="num" w:pos="5040"/>
+        </w:tabs>
+        <w:ind w:left="5040" w:hanging="360"/>
+      </w:pPr>
+    </w:lvl>
+    <w:lvl w:ilvl="7" w:tentative="1">
+      <w:start w:val="1"/>
+      <w:numFmt w:val="decimal"/>
+      <w:lvlText w:val="%8."/>
+      <w:lvlJc w:val="left"/>
+      <w:pPr>
+        <w:tabs>
+          <w:tab w:val="num" w:pos="5760"/>
+        </w:tabs>
+        <w:ind w:left="5760" w:hanging="360"/>
+      </w:pPr>
+    </w:lvl>
+    <w:lvl w:ilvl="8" w:tentative="1">
+      <w:start w:val="1"/>
+      <w:numFmt w:val="decimal"/>
+      <w:lvlText w:val="%9."/>
+      <w:lvlJc w:val="left"/>
+      <w:pPr>
+        <w:tabs>
+          <w:tab w:val="num" w:pos="6480"/>
+        </w:tabs>
+        <w:ind w:left="6480" w:hanging="360"/>
+      </w:pPr>
+    </w:lvl>
+  </w:abstractNum>
+  <w:abstractNum w:abstractNumId="3" w15:restartNumberingAfterBreak="0">
+    <w:nsid w:val="1E2E006E"/>
+    <w:multiLevelType w:val="multilevel"/>
+    <w:tmpl w:val="6B48219A"/>
+    <w:lvl w:ilvl="0">
+      <w:start w:val="1"/>
+      <w:numFmt w:val="decimal"/>
+      <w:lvlText w:val="%1."/>
+      <w:lvlJc w:val="left"/>
+      <w:pPr>
+        <w:tabs>
+          <w:tab w:val="num" w:pos="720"/>
+        </w:tabs>
+        <w:ind w:left="720" w:hanging="360"/>
+      </w:pPr>
+    </w:lvl>
+    <w:lvl w:ilvl="1" w:tentative="1">
+      <w:start w:val="1"/>
+      <w:numFmt w:val="decimal"/>
+      <w:lvlText w:val="%2."/>
+      <w:lvlJc w:val="left"/>
+      <w:pPr>
+        <w:tabs>
+          <w:tab w:val="num" w:pos="1440"/>
+        </w:tabs>
+        <w:ind w:left="1440" w:hanging="360"/>
+      </w:pPr>
+    </w:lvl>
+    <w:lvl w:ilvl="2" w:tentative="1">
+      <w:start w:val="1"/>
+      <w:numFmt w:val="decimal"/>
+      <w:lvlText w:val="%3."/>
+      <w:lvlJc w:val="left"/>
+      <w:pPr>
+        <w:tabs>
+          <w:tab w:val="num" w:pos="2160"/>
+        </w:tabs>
+        <w:ind w:left="2160" w:hanging="360"/>
+      </w:pPr>
+    </w:lvl>
+    <w:lvl w:ilvl="3" w:tentative="1">
+      <w:start w:val="1"/>
+      <w:numFmt w:val="decimal"/>
+      <w:lvlText w:val="%4."/>
+      <w:lvlJc w:val="left"/>
+      <w:pPr>
+        <w:tabs>
+          <w:tab w:val="num" w:pos="2880"/>
+        </w:tabs>
+        <w:ind w:left="2880" w:hanging="360"/>
+      </w:pPr>
+    </w:lvl>
+    <w:lvl w:ilvl="4" w:tentative="1">
+      <w:start w:val="1"/>
+      <w:numFmt w:val="decimal"/>
+      <w:lvlText w:val="%5."/>
+      <w:lvlJc w:val="left"/>
+      <w:pPr>
+        <w:tabs>
+          <w:tab w:val="num" w:pos="3600"/>
+        </w:tabs>
+        <w:ind w:left="3600" w:hanging="360"/>
+      </w:pPr>
+    </w:lvl>
+    <w:lvl w:ilvl="5" w:tentative="1">
+      <w:start w:val="1"/>
+      <w:numFmt w:val="decimal"/>
+      <w:lvlText w:val="%6."/>
+      <w:lvlJc w:val="left"/>
+      <w:pPr>
+        <w:tabs>
+          <w:tab w:val="num" w:pos="4320"/>
+        </w:tabs>
+        <w:ind w:left="4320" w:hanging="360"/>
+      </w:pPr>
+    </w:lvl>
+    <w:lvl w:ilvl="6" w:tentative="1">
+      <w:start w:val="1"/>
+      <w:numFmt w:val="decimal"/>
+      <w:lvlText w:val="%7."/>
+      <w:lvlJc w:val="left"/>
+      <w:pPr>
+        <w:tabs>
+          <w:tab w:val="num" w:pos="5040"/>
+        </w:tabs>
+        <w:ind w:left="5040" w:hanging="360"/>
+      </w:pPr>
+    </w:lvl>
+    <w:lvl w:ilvl="7" w:tentative="1">
+      <w:start w:val="1"/>
+      <w:numFmt w:val="decimal"/>
+      <w:lvlText w:val="%8."/>
+      <w:lvlJc w:val="left"/>
+      <w:pPr>
+        <w:tabs>
+          <w:tab w:val="num" w:pos="5760"/>
+        </w:tabs>
+        <w:ind w:left="5760" w:hanging="360"/>
+      </w:pPr>
+    </w:lvl>
+    <w:lvl w:ilvl="8" w:tentative="1">
+      <w:start w:val="1"/>
+      <w:numFmt w:val="decimal"/>
+      <w:lvlText w:val="%9."/>
+      <w:lvlJc w:val="left"/>
+      <w:pPr>
+        <w:tabs>
+          <w:tab w:val="num" w:pos="6480"/>
+        </w:tabs>
+        <w:ind w:left="6480" w:hanging="360"/>
+      </w:pPr>
+    </w:lvl>
+  </w:abstractNum>
+  <w:abstractNum w:abstractNumId="4" w15:restartNumberingAfterBreak="0">
+    <w:nsid w:val="24E5126D"/>
+    <w:multiLevelType w:val="multilevel"/>
+    <w:tmpl w:val="0AA6F1E2"/>
+    <w:lvl w:ilvl="0">
+      <w:start w:val="1"/>
+      <w:numFmt w:val="decimal"/>
+      <w:lvlText w:val="%1."/>
+      <w:lvlJc w:val="left"/>
+      <w:pPr>
+        <w:tabs>
+          <w:tab w:val="num" w:pos="720"/>
+        </w:tabs>
+        <w:ind w:left="720" w:hanging="360"/>
+      </w:pPr>
+    </w:lvl>
+    <w:lvl w:ilvl="1" w:tentative="1">
+      <w:start w:val="1"/>
+      <w:numFmt w:val="decimal"/>
+      <w:lvlText w:val="%2."/>
+      <w:lvlJc w:val="left"/>
+      <w:pPr>
+        <w:tabs>
+          <w:tab w:val="num" w:pos="1440"/>
+        </w:tabs>
+        <w:ind w:left="1440" w:hanging="360"/>
+      </w:pPr>
+    </w:lvl>
+    <w:lvl w:ilvl="2" w:tentative="1">
+      <w:start w:val="1"/>
+      <w:numFmt w:val="decimal"/>
+      <w:lvlText w:val="%3."/>
+      <w:lvlJc w:val="left"/>
+      <w:pPr>
+        <w:tabs>
+          <w:tab w:val="num" w:pos="2160"/>
+        </w:tabs>
+        <w:ind w:left="2160" w:hanging="360"/>
+      </w:pPr>
+    </w:lvl>
+    <w:lvl w:ilvl="3" w:tentative="1">
+      <w:start w:val="1"/>
+      <w:numFmt w:val="decimal"/>
+      <w:lvlText w:val="%4."/>
+      <w:lvlJc w:val="left"/>
+      <w:pPr>
+        <w:tabs>
+          <w:tab w:val="num" w:pos="2880"/>
+        </w:tabs>
+        <w:ind w:left="2880" w:hanging="360"/>
+      </w:pPr>
+    </w:lvl>
+    <w:lvl w:ilvl="4" w:tentative="1">
+      <w:start w:val="1"/>
+      <w:numFmt w:val="decimal"/>
+      <w:lvlText w:val="%5."/>
+      <w:lvlJc w:val="left"/>
+      <w:pPr>
+        <w:tabs>
+          <w:tab w:val="num" w:pos="3600"/>
+        </w:tabs>
+        <w:ind w:left="3600" w:hanging="360"/>
+      </w:pPr>
+    </w:lvl>
+    <w:lvl w:ilvl="5" w:tentative="1">
+      <w:start w:val="1"/>
+      <w:numFmt w:val="decimal"/>
+      <w:lvlText w:val="%6."/>
+      <w:lvlJc w:val="left"/>
+      <w:pPr>
+        <w:tabs>
+          <w:tab w:val="num" w:pos="4320"/>
+        </w:tabs>
+        <w:ind w:left="4320" w:hanging="360"/>
+      </w:pPr>
+    </w:lvl>
+    <w:lvl w:ilvl="6" w:tentative="1">
+      <w:start w:val="1"/>
+      <w:numFmt w:val="decimal"/>
+      <w:lvlText w:val="%7."/>
+      <w:lvlJc w:val="left"/>
+      <w:pPr>
+        <w:tabs>
+          <w:tab w:val="num" w:pos="5040"/>
+        </w:tabs>
+        <w:ind w:left="5040" w:hanging="360"/>
+      </w:pPr>
+    </w:lvl>
+    <w:lvl w:ilvl="7" w:tentative="1">
+      <w:start w:val="1"/>
+      <w:numFmt w:val="decimal"/>
+      <w:lvlText w:val="%8."/>
+      <w:lvlJc w:val="left"/>
+      <w:pPr>
+        <w:tabs>
+          <w:tab w:val="num" w:pos="5760"/>
+        </w:tabs>
+        <w:ind w:left="5760" w:hanging="360"/>
+      </w:pPr>
+    </w:lvl>
+    <w:lvl w:ilvl="8" w:tentative="1">
+      <w:start w:val="1"/>
+      <w:numFmt w:val="decimal"/>
+      <w:lvlText w:val="%9."/>
+      <w:lvlJc w:val="left"/>
+      <w:pPr>
+        <w:tabs>
+          <w:tab w:val="num" w:pos="6480"/>
+        </w:tabs>
+        <w:ind w:left="6480" w:hanging="360"/>
+      </w:pPr>
+    </w:lvl>
+  </w:abstractNum>
+  <w:abstractNum w:abstractNumId="5" w15:restartNumberingAfterBreak="0">
+    <w:nsid w:val="28766A10"/>
+    <w:multiLevelType w:val="multilevel"/>
+    <w:tmpl w:val="6AFA6ED4"/>
+    <w:lvl w:ilvl="0">
+      <w:start w:val="1"/>
+      <w:numFmt w:val="decimal"/>
+      <w:lvlText w:val="%1."/>
+      <w:lvlJc w:val="left"/>
+      <w:pPr>
+        <w:tabs>
+          <w:tab w:val="num" w:pos="720"/>
+        </w:tabs>
+        <w:ind w:left="720" w:hanging="360"/>
+      </w:pPr>
+    </w:lvl>
+    <w:lvl w:ilvl="1" w:tentative="1">
+      <w:start w:val="1"/>
+      <w:numFmt w:val="decimal"/>
+      <w:lvlText w:val="%2."/>
+      <w:lvlJc w:val="left"/>
+      <w:pPr>
+        <w:tabs>
+          <w:tab w:val="num" w:pos="1440"/>
+        </w:tabs>
+        <w:ind w:left="1440" w:hanging="360"/>
+      </w:pPr>
+    </w:lvl>
+    <w:lvl w:ilvl="2" w:tentative="1">
+      <w:start w:val="1"/>
+      <w:numFmt w:val="decimal"/>
+      <w:lvlText w:val="%3."/>
+      <w:lvlJc w:val="left"/>
+      <w:pPr>
+        <w:tabs>
+          <w:tab w:val="num" w:pos="2160"/>
+        </w:tabs>
+        <w:ind w:left="2160" w:hanging="360"/>
+      </w:pPr>
+    </w:lvl>
+    <w:lvl w:ilvl="3" w:tentative="1">
+      <w:start w:val="1"/>
+      <w:numFmt w:val="decimal"/>
+      <w:lvlText w:val="%4."/>
+      <w:lvlJc w:val="left"/>
+      <w:pPr>
+        <w:tabs>
+          <w:tab w:val="num" w:pos="2880"/>
+        </w:tabs>
+        <w:ind w:left="2880" w:hanging="360"/>
+      </w:pPr>
+    </w:lvl>
+    <w:lvl w:ilvl="4" w:tentative="1">
+      <w:start w:val="1"/>
+      <w:numFmt w:val="decimal"/>
+      <w:lvlText w:val="%5."/>
+      <w:lvlJc w:val="left"/>
+      <w:pPr>
+        <w:tabs>
+          <w:tab w:val="num" w:pos="3600"/>
+        </w:tabs>
+        <w:ind w:left="3600" w:hanging="360"/>
+      </w:pPr>
+    </w:lvl>
+    <w:lvl w:ilvl="5" w:tentative="1">
+      <w:start w:val="1"/>
+      <w:numFmt w:val="decimal"/>
+      <w:lvlText w:val="%6."/>
+      <w:lvlJc w:val="left"/>
+      <w:pPr>
+        <w:tabs>
+          <w:tab w:val="num" w:pos="4320"/>
+        </w:tabs>
+        <w:ind w:left="4320" w:hanging="360"/>
+      </w:pPr>
+    </w:lvl>
+    <w:lvl w:ilvl="6" w:tentative="1">
+      <w:start w:val="1"/>
+      <w:numFmt w:val="decimal"/>
+      <w:lvlText w:val="%7."/>
+      <w:lvlJc w:val="left"/>
+      <w:pPr>
+        <w:tabs>
+          <w:tab w:val="num" w:pos="5040"/>
+        </w:tabs>
+        <w:ind w:left="5040" w:hanging="360"/>
+      </w:pPr>
+    </w:lvl>
+    <w:lvl w:ilvl="7" w:tentative="1">
+      <w:start w:val="1"/>
+      <w:numFmt w:val="decimal"/>
+      <w:lvlText w:val="%8."/>
+      <w:lvlJc w:val="left"/>
+      <w:pPr>
+        <w:tabs>
+          <w:tab w:val="num" w:pos="5760"/>
+        </w:tabs>
+        <w:ind w:left="5760" w:hanging="360"/>
+      </w:pPr>
+    </w:lvl>
+    <w:lvl w:ilvl="8" w:tentative="1">
+      <w:start w:val="1"/>
+      <w:numFmt w:val="decimal"/>
+      <w:lvlText w:val="%9."/>
+      <w:lvlJc w:val="left"/>
+      <w:pPr>
+        <w:tabs>
+          <w:tab w:val="num" w:pos="6480"/>
+        </w:tabs>
+        <w:ind w:left="6480" w:hanging="360"/>
+      </w:pPr>
+    </w:lvl>
+  </w:abstractNum>
+  <w:abstractNum w:abstractNumId="6" w15:restartNumberingAfterBreak="0">
+    <w:nsid w:val="2A25021D"/>
+    <w:multiLevelType w:val="multilevel"/>
+    <w:tmpl w:val="8916A908"/>
+    <w:lvl w:ilvl="0">
+      <w:start w:val="1"/>
+      <w:numFmt w:val="decimal"/>
+      <w:lvlText w:val="%1."/>
+      <w:lvlJc w:val="left"/>
+      <w:pPr>
+        <w:tabs>
+          <w:tab w:val="num" w:pos="720"/>
+        </w:tabs>
+        <w:ind w:left="720" w:hanging="360"/>
+      </w:pPr>
+    </w:lvl>
+    <w:lvl w:ilvl="1" w:tentative="1">
+      <w:start w:val="1"/>
+      <w:numFmt w:val="decimal"/>
+      <w:lvlText w:val="%2."/>
+      <w:lvlJc w:val="left"/>
+      <w:pPr>
+        <w:tabs>
+          <w:tab w:val="num" w:pos="1440"/>
+        </w:tabs>
+        <w:ind w:left="1440" w:hanging="360"/>
+      </w:pPr>
+    </w:lvl>
+    <w:lvl w:ilvl="2" w:tentative="1">
+      <w:start w:val="1"/>
+      <w:numFmt w:val="decimal"/>
+      <w:lvlText w:val="%3."/>
+      <w:lvlJc w:val="left"/>
+      <w:pPr>
+        <w:tabs>
+          <w:tab w:val="num" w:pos="2160"/>
+        </w:tabs>
+        <w:ind w:left="2160" w:hanging="360"/>
+      </w:pPr>
+    </w:lvl>
+    <w:lvl w:ilvl="3" w:tentative="1">
+      <w:start w:val="1"/>
+      <w:numFmt w:val="decimal"/>
+      <w:lvlText w:val="%4."/>
+      <w:lvlJc w:val="left"/>
+      <w:pPr>
+        <w:tabs>
+          <w:tab w:val="num" w:pos="2880"/>
+        </w:tabs>
+        <w:ind w:left="2880" w:hanging="360"/>
+      </w:pPr>
+    </w:lvl>
+    <w:lvl w:ilvl="4" w:tentative="1">
+      <w:start w:val="1"/>
+      <w:numFmt w:val="decimal"/>
+      <w:lvlText w:val="%5."/>
+      <w:lvlJc w:val="left"/>
+      <w:pPr>
+        <w:tabs>
+          <w:tab w:val="num" w:pos="3600"/>
+        </w:tabs>
+        <w:ind w:left="3600" w:hanging="360"/>
+      </w:pPr>
+    </w:lvl>
+    <w:lvl w:ilvl="5" w:tentative="1">
+      <w:start w:val="1"/>
+      <w:numFmt w:val="decimal"/>
+      <w:lvlText w:val="%6."/>
+      <w:lvlJc w:val="left"/>
+      <w:pPr>
+        <w:tabs>
+          <w:tab w:val="num" w:pos="4320"/>
+        </w:tabs>
+        <w:ind w:left="4320" w:hanging="360"/>
+      </w:pPr>
+    </w:lvl>
+    <w:lvl w:ilvl="6" w:tentative="1">
+      <w:start w:val="1"/>
+      <w:numFmt w:val="decimal"/>
+      <w:lvlText w:val="%7."/>
+      <w:lvlJc w:val="left"/>
+      <w:pPr>
+        <w:tabs>
+          <w:tab w:val="num" w:pos="5040"/>
+        </w:tabs>
+        <w:ind w:left="5040" w:hanging="360"/>
+      </w:pPr>
+    </w:lvl>
+    <w:lvl w:ilvl="7" w:tentative="1">
+      <w:start w:val="1"/>
+      <w:numFmt w:val="decimal"/>
+      <w:lvlText w:val="%8."/>
+      <w:lvlJc w:val="left"/>
+      <w:pPr>
+        <w:tabs>
+          <w:tab w:val="num" w:pos="5760"/>
+        </w:tabs>
+        <w:ind w:left="5760" w:hanging="360"/>
+      </w:pPr>
+    </w:lvl>
+    <w:lvl w:ilvl="8" w:tentative="1">
+      <w:start w:val="1"/>
+      <w:numFmt w:val="decimal"/>
+      <w:lvlText w:val="%9."/>
+      <w:lvlJc w:val="left"/>
+      <w:pPr>
+        <w:tabs>
+          <w:tab w:val="num" w:pos="6480"/>
+        </w:tabs>
+        <w:ind w:left="6480" w:hanging="360"/>
+      </w:pPr>
+    </w:lvl>
+  </w:abstractNum>
+  <w:abstractNum w:abstractNumId="7" w15:restartNumberingAfterBreak="0">
+    <w:nsid w:val="315F36B2"/>
+    <w:multiLevelType w:val="multilevel"/>
+    <w:tmpl w:val="330A602A"/>
+    <w:lvl w:ilvl="0">
+      <w:start w:val="1"/>
+      <w:numFmt w:val="decimal"/>
+      <w:lvlText w:val="%1."/>
+      <w:lvlJc w:val="left"/>
+      <w:pPr>
+        <w:tabs>
+          <w:tab w:val="num" w:pos="720"/>
+        </w:tabs>
+        <w:ind w:left="720" w:hanging="360"/>
+      </w:pPr>
+    </w:lvl>
+    <w:lvl w:ilvl="1" w:tentative="1">
+      <w:start w:val="1"/>
+      <w:numFmt w:val="decimal"/>
+      <w:lvlText w:val="%2."/>
+      <w:lvlJc w:val="left"/>
+      <w:pPr>
+        <w:tabs>
+          <w:tab w:val="num" w:pos="1440"/>
+        </w:tabs>
+        <w:ind w:left="1440" w:hanging="360"/>
+      </w:pPr>
+    </w:lvl>
+    <w:lvl w:ilvl="2" w:tentative="1">
+      <w:start w:val="1"/>
+      <w:numFmt w:val="decimal"/>
+      <w:lvlText w:val="%3."/>
+      <w:lvlJc w:val="left"/>
+      <w:pPr>
+        <w:tabs>
+          <w:tab w:val="num" w:pos="2160"/>
+        </w:tabs>
+        <w:ind w:left="2160" w:hanging="360"/>
+      </w:pPr>
+    </w:lvl>
+    <w:lvl w:ilvl="3" w:tentative="1">
+      <w:start w:val="1"/>
+      <w:numFmt w:val="decimal"/>
+      <w:lvlText w:val="%4."/>
+      <w:lvlJc w:val="left"/>
+      <w:pPr>
+        <w:tabs>
+          <w:tab w:val="num" w:pos="2880"/>
+        </w:tabs>
+        <w:ind w:left="2880" w:hanging="360"/>
+      </w:pPr>
+    </w:lvl>
+    <w:lvl w:ilvl="4" w:tentative="1">
+      <w:start w:val="1"/>
+      <w:numFmt w:val="decimal"/>
+      <w:lvlText w:val="%5."/>
+      <w:lvlJc w:val="left"/>
+      <w:pPr>
+        <w:tabs>
+          <w:tab w:val="num" w:pos="3600"/>
+        </w:tabs>
+        <w:ind w:left="3600" w:hanging="360"/>
+      </w:pPr>
+    </w:lvl>
+    <w:lvl w:ilvl="5" w:tentative="1">
+      <w:start w:val="1"/>
+      <w:numFmt w:val="decimal"/>
+      <w:lvlText w:val="%6."/>
+      <w:lvlJc w:val="left"/>
+      <w:pPr>
+        <w:tabs>
+          <w:tab w:val="num" w:pos="4320"/>
+        </w:tabs>
+        <w:ind w:left="4320" w:hanging="360"/>
+      </w:pPr>
+    </w:lvl>
+    <w:lvl w:ilvl="6" w:tentative="1">
+      <w:start w:val="1"/>
+      <w:numFmt w:val="decimal"/>
+      <w:lvlText w:val="%7."/>
+      <w:lvlJc w:val="left"/>
+      <w:pPr>
+        <w:tabs>
+          <w:tab w:val="num" w:pos="5040"/>
+        </w:tabs>
+        <w:ind w:left="5040" w:hanging="360"/>
+      </w:pPr>
+    </w:lvl>
+    <w:lvl w:ilvl="7" w:tentative="1">
+      <w:start w:val="1"/>
+      <w:numFmt w:val="decimal"/>
+      <w:lvlText w:val="%8."/>
+      <w:lvlJc w:val="left"/>
+      <w:pPr>
+        <w:tabs>
+          <w:tab w:val="num" w:pos="5760"/>
+        </w:tabs>
+        <w:ind w:left="5760" w:hanging="360"/>
+      </w:pPr>
+    </w:lvl>
+    <w:lvl w:ilvl="8" w:tentative="1">
+      <w:start w:val="1"/>
+      <w:numFmt w:val="decimal"/>
+      <w:lvlText w:val="%9."/>
+      <w:lvlJc w:val="left"/>
+      <w:pPr>
+        <w:tabs>
+          <w:tab w:val="num" w:pos="6480"/>
+        </w:tabs>
+        <w:ind w:left="6480" w:hanging="360"/>
+      </w:pPr>
+    </w:lvl>
+  </w:abstractNum>
+  <w:abstractNum w:abstractNumId="8" w15:restartNumberingAfterBreak="0">
+    <w:nsid w:val="31694C27"/>
+    <w:multiLevelType w:val="multilevel"/>
+    <w:tmpl w:val="54469340"/>
+    <w:lvl w:ilvl="0">
+      <w:start w:val="1"/>
+      <w:numFmt w:val="decimal"/>
+      <w:lvlText w:val="%1."/>
+      <w:lvlJc w:val="left"/>
+      <w:pPr>
+        <w:tabs>
+          <w:tab w:val="num" w:pos="720"/>
+        </w:tabs>
+        <w:ind w:left="720" w:hanging="360"/>
+      </w:pPr>
+    </w:lvl>
+    <w:lvl w:ilvl="1" w:tentative="1">
+      <w:start w:val="1"/>
+      <w:numFmt w:val="decimal"/>
+      <w:lvlText w:val="%2."/>
+      <w:lvlJc w:val="left"/>
+      <w:pPr>
+        <w:tabs>
+          <w:tab w:val="num" w:pos="1440"/>
+        </w:tabs>
+        <w:ind w:left="1440" w:hanging="360"/>
+      </w:pPr>
+    </w:lvl>
+    <w:lvl w:ilvl="2" w:tentative="1">
+      <w:start w:val="1"/>
+      <w:numFmt w:val="decimal"/>
+      <w:lvlText w:val="%3."/>
+      <w:lvlJc w:val="left"/>
+      <w:pPr>
+        <w:tabs>
+          <w:tab w:val="num" w:pos="2160"/>
+        </w:tabs>
+        <w:ind w:left="2160" w:hanging="360"/>
+      </w:pPr>
+    </w:lvl>
+    <w:lvl w:ilvl="3" w:tentative="1">
+      <w:start w:val="1"/>
+      <w:numFmt w:val="decimal"/>
+      <w:lvlText w:val="%4."/>
+      <w:lvlJc w:val="left"/>
+      <w:pPr>
+        <w:tabs>
+          <w:tab w:val="num" w:pos="2880"/>
+        </w:tabs>
+        <w:ind w:left="2880" w:hanging="360"/>
+      </w:pPr>
+    </w:lvl>
+    <w:lvl w:ilvl="4" w:tentative="1">
+      <w:start w:val="1"/>
+      <w:numFmt w:val="decimal"/>
+      <w:lvlText w:val="%5."/>
+      <w:lvlJc w:val="left"/>
+      <w:pPr>
+        <w:tabs>
+          <w:tab w:val="num" w:pos="3600"/>
+        </w:tabs>
+        <w:ind w:left="3600" w:hanging="360"/>
+      </w:pPr>
+    </w:lvl>
+    <w:lvl w:ilvl="5" w:tentative="1">
+      <w:start w:val="1"/>
+      <w:numFmt w:val="decimal"/>
+      <w:lvlText w:val="%6."/>
+      <w:lvlJc w:val="left"/>
+      <w:pPr>
+        <w:tabs>
+          <w:tab w:val="num" w:pos="4320"/>
+        </w:tabs>
+        <w:ind w:left="4320" w:hanging="360"/>
+      </w:pPr>
+    </w:lvl>
+    <w:lvl w:ilvl="6" w:tentative="1">
+      <w:start w:val="1"/>
+      <w:numFmt w:val="decimal"/>
+      <w:lvlText w:val="%7."/>
+      <w:lvlJc w:val="left"/>
+      <w:pPr>
+        <w:tabs>
+          <w:tab w:val="num" w:pos="5040"/>
+        </w:tabs>
+        <w:ind w:left="5040" w:hanging="360"/>
+      </w:pPr>
+    </w:lvl>
+    <w:lvl w:ilvl="7" w:tentative="1">
+      <w:start w:val="1"/>
+      <w:numFmt w:val="decimal"/>
+      <w:lvlText w:val="%8."/>
+      <w:lvlJc w:val="left"/>
+      <w:pPr>
+        <w:tabs>
+          <w:tab w:val="num" w:pos="5760"/>
+        </w:tabs>
+        <w:ind w:left="5760" w:hanging="360"/>
+      </w:pPr>
+    </w:lvl>
+    <w:lvl w:ilvl="8" w:tentative="1">
+      <w:start w:val="1"/>
+      <w:numFmt w:val="decimal"/>
+      <w:lvlText w:val="%9."/>
+      <w:lvlJc w:val="left"/>
+      <w:pPr>
+        <w:tabs>
+          <w:tab w:val="num" w:pos="6480"/>
+        </w:tabs>
+        <w:ind w:left="6480" w:hanging="360"/>
+      </w:pPr>
+    </w:lvl>
+  </w:abstractNum>
+  <w:abstractNum w:abstractNumId="9" w15:restartNumberingAfterBreak="0">
     <w:nsid w:val="3F3B7F6D"/>
     <w:multiLevelType w:val="multilevel"/>
     <w:tmpl w:val="798C4C62"/>
@@ -685,7 +4506,233 @@
       </w:rPr>
     </w:lvl>
   </w:abstractNum>
-  <w:abstractNum w:abstractNumId="1" w15:restartNumberingAfterBreak="0">
+  <w:abstractNum w:abstractNumId="10" w15:restartNumberingAfterBreak="0">
+    <w:nsid w:val="4E4F5FB4"/>
+    <w:multiLevelType w:val="multilevel"/>
+    <w:tmpl w:val="A89A8778"/>
+    <w:lvl w:ilvl="0">
+      <w:start w:val="1"/>
+      <w:numFmt w:val="decimal"/>
+      <w:lvlText w:val="%1."/>
+      <w:lvlJc w:val="left"/>
+      <w:pPr>
+        <w:tabs>
+          <w:tab w:val="num" w:pos="720"/>
+        </w:tabs>
+        <w:ind w:left="720" w:hanging="360"/>
+      </w:pPr>
+    </w:lvl>
+    <w:lvl w:ilvl="1" w:tentative="1">
+      <w:start w:val="1"/>
+      <w:numFmt w:val="decimal"/>
+      <w:lvlText w:val="%2."/>
+      <w:lvlJc w:val="left"/>
+      <w:pPr>
+        <w:tabs>
+          <w:tab w:val="num" w:pos="1440"/>
+        </w:tabs>
+        <w:ind w:left="1440" w:hanging="360"/>
+      </w:pPr>
+    </w:lvl>
+    <w:lvl w:ilvl="2" w:tentative="1">
+      <w:start w:val="1"/>
+      <w:numFmt w:val="decimal"/>
+      <w:lvlText w:val="%3."/>
+      <w:lvlJc w:val="left"/>
+      <w:pPr>
+        <w:tabs>
+          <w:tab w:val="num" w:pos="2160"/>
+        </w:tabs>
+        <w:ind w:left="2160" w:hanging="360"/>
+      </w:pPr>
+    </w:lvl>
+    <w:lvl w:ilvl="3" w:tentative="1">
+      <w:start w:val="1"/>
+      <w:numFmt w:val="decimal"/>
+      <w:lvlText w:val="%4."/>
+      <w:lvlJc w:val="left"/>
+      <w:pPr>
+        <w:tabs>
+          <w:tab w:val="num" w:pos="2880"/>
+        </w:tabs>
+        <w:ind w:left="2880" w:hanging="360"/>
+      </w:pPr>
+    </w:lvl>
+    <w:lvl w:ilvl="4" w:tentative="1">
+      <w:start w:val="1"/>
+      <w:numFmt w:val="decimal"/>
+      <w:lvlText w:val="%5."/>
+      <w:lvlJc w:val="left"/>
+      <w:pPr>
+        <w:tabs>
+          <w:tab w:val="num" w:pos="3600"/>
+        </w:tabs>
+        <w:ind w:left="3600" w:hanging="360"/>
+      </w:pPr>
+    </w:lvl>
+    <w:lvl w:ilvl="5" w:tentative="1">
+      <w:start w:val="1"/>
+      <w:numFmt w:val="decimal"/>
+      <w:lvlText w:val="%6."/>
+      <w:lvlJc w:val="left"/>
+      <w:pPr>
+        <w:tabs>
+          <w:tab w:val="num" w:pos="4320"/>
+        </w:tabs>
+        <w:ind w:left="4320" w:hanging="360"/>
+      </w:pPr>
+    </w:lvl>
+    <w:lvl w:ilvl="6" w:tentative="1">
+      <w:start w:val="1"/>
+      <w:numFmt w:val="decimal"/>
+      <w:lvlText w:val="%7."/>
+      <w:lvlJc w:val="left"/>
+      <w:pPr>
+        <w:tabs>
+          <w:tab w:val="num" w:pos="5040"/>
+        </w:tabs>
+        <w:ind w:left="5040" w:hanging="360"/>
+      </w:pPr>
+    </w:lvl>
+    <w:lvl w:ilvl="7" w:tentative="1">
+      <w:start w:val="1"/>
+      <w:numFmt w:val="decimal"/>
+      <w:lvlText w:val="%8."/>
+      <w:lvlJc w:val="left"/>
+      <w:pPr>
+        <w:tabs>
+          <w:tab w:val="num" w:pos="5760"/>
+        </w:tabs>
+        <w:ind w:left="5760" w:hanging="360"/>
+      </w:pPr>
+    </w:lvl>
+    <w:lvl w:ilvl="8" w:tentative="1">
+      <w:start w:val="1"/>
+      <w:numFmt w:val="decimal"/>
+      <w:lvlText w:val="%9."/>
+      <w:lvlJc w:val="left"/>
+      <w:pPr>
+        <w:tabs>
+          <w:tab w:val="num" w:pos="6480"/>
+        </w:tabs>
+        <w:ind w:left="6480" w:hanging="360"/>
+      </w:pPr>
+    </w:lvl>
+  </w:abstractNum>
+  <w:abstractNum w:abstractNumId="11" w15:restartNumberingAfterBreak="0">
+    <w:nsid w:val="4EF306F4"/>
+    <w:multiLevelType w:val="multilevel"/>
+    <w:tmpl w:val="CD4A1B78"/>
+    <w:lvl w:ilvl="0">
+      <w:start w:val="1"/>
+      <w:numFmt w:val="decimal"/>
+      <w:lvlText w:val="%1."/>
+      <w:lvlJc w:val="left"/>
+      <w:pPr>
+        <w:tabs>
+          <w:tab w:val="num" w:pos="720"/>
+        </w:tabs>
+        <w:ind w:left="720" w:hanging="360"/>
+      </w:pPr>
+    </w:lvl>
+    <w:lvl w:ilvl="1" w:tentative="1">
+      <w:start w:val="1"/>
+      <w:numFmt w:val="decimal"/>
+      <w:lvlText w:val="%2."/>
+      <w:lvlJc w:val="left"/>
+      <w:pPr>
+        <w:tabs>
+          <w:tab w:val="num" w:pos="1440"/>
+        </w:tabs>
+        <w:ind w:left="1440" w:hanging="360"/>
+      </w:pPr>
+    </w:lvl>
+    <w:lvl w:ilvl="2" w:tentative="1">
+      <w:start w:val="1"/>
+      <w:numFmt w:val="decimal"/>
+      <w:lvlText w:val="%3."/>
+      <w:lvlJc w:val="left"/>
+      <w:pPr>
+        <w:tabs>
+          <w:tab w:val="num" w:pos="2160"/>
+        </w:tabs>
+        <w:ind w:left="2160" w:hanging="360"/>
+      </w:pPr>
+    </w:lvl>
+    <w:lvl w:ilvl="3" w:tentative="1">
+      <w:start w:val="1"/>
+      <w:numFmt w:val="decimal"/>
+      <w:lvlText w:val="%4."/>
+      <w:lvlJc w:val="left"/>
+      <w:pPr>
+        <w:tabs>
+          <w:tab w:val="num" w:pos="2880"/>
+        </w:tabs>
+        <w:ind w:left="2880" w:hanging="360"/>
+      </w:pPr>
+    </w:lvl>
+    <w:lvl w:ilvl="4" w:tentative="1">
+      <w:start w:val="1"/>
+      <w:numFmt w:val="decimal"/>
+      <w:lvlText w:val="%5."/>
+      <w:lvlJc w:val="left"/>
+      <w:pPr>
+        <w:tabs>
+          <w:tab w:val="num" w:pos="3600"/>
+        </w:tabs>
+        <w:ind w:left="3600" w:hanging="360"/>
+      </w:pPr>
+    </w:lvl>
+    <w:lvl w:ilvl="5" w:tentative="1">
+      <w:start w:val="1"/>
+      <w:numFmt w:val="decimal"/>
+      <w:lvlText w:val="%6."/>
+      <w:lvlJc w:val="left"/>
+      <w:pPr>
+        <w:tabs>
+          <w:tab w:val="num" w:pos="4320"/>
+        </w:tabs>
+        <w:ind w:left="4320" w:hanging="360"/>
+      </w:pPr>
+    </w:lvl>
+    <w:lvl w:ilvl="6" w:tentative="1">
+      <w:start w:val="1"/>
+      <w:numFmt w:val="decimal"/>
+      <w:lvlText w:val="%7."/>
+      <w:lvlJc w:val="left"/>
+      <w:pPr>
+        <w:tabs>
+          <w:tab w:val="num" w:pos="5040"/>
+        </w:tabs>
+        <w:ind w:left="5040" w:hanging="360"/>
+      </w:pPr>
+    </w:lvl>
+    <w:lvl w:ilvl="7" w:tentative="1">
+      <w:start w:val="1"/>
+      <w:numFmt w:val="decimal"/>
+      <w:lvlText w:val="%8."/>
+      <w:lvlJc w:val="left"/>
+      <w:pPr>
+        <w:tabs>
+          <w:tab w:val="num" w:pos="5760"/>
+        </w:tabs>
+        <w:ind w:left="5760" w:hanging="360"/>
+      </w:pPr>
+    </w:lvl>
+    <w:lvl w:ilvl="8" w:tentative="1">
+      <w:start w:val="1"/>
+      <w:numFmt w:val="decimal"/>
+      <w:lvlText w:val="%9."/>
+      <w:lvlJc w:val="left"/>
+      <w:pPr>
+        <w:tabs>
+          <w:tab w:val="num" w:pos="6480"/>
+        </w:tabs>
+        <w:ind w:left="6480" w:hanging="360"/>
+      </w:pPr>
+    </w:lvl>
+  </w:abstractNum>
+  <w:abstractNum w:abstractNumId="12" w15:restartNumberingAfterBreak="0">
     <w:nsid w:val="62331A7A"/>
     <w:multiLevelType w:val="multilevel"/>
     <w:tmpl w:val="BE0EC7A8"/>
@@ -834,11 +4881,392 @@
       </w:rPr>
     </w:lvl>
   </w:abstractNum>
+  <w:abstractNum w:abstractNumId="13" w15:restartNumberingAfterBreak="0">
+    <w:nsid w:val="6CFD028A"/>
+    <w:multiLevelType w:val="multilevel"/>
+    <w:tmpl w:val="1682F1C0"/>
+    <w:lvl w:ilvl="0">
+      <w:start w:val="1"/>
+      <w:numFmt w:val="decimal"/>
+      <w:lvlText w:val="%1."/>
+      <w:lvlJc w:val="left"/>
+      <w:pPr>
+        <w:tabs>
+          <w:tab w:val="num" w:pos="720"/>
+        </w:tabs>
+        <w:ind w:left="720" w:hanging="360"/>
+      </w:pPr>
+    </w:lvl>
+    <w:lvl w:ilvl="1" w:tentative="1">
+      <w:start w:val="1"/>
+      <w:numFmt w:val="decimal"/>
+      <w:lvlText w:val="%2."/>
+      <w:lvlJc w:val="left"/>
+      <w:pPr>
+        <w:tabs>
+          <w:tab w:val="num" w:pos="1440"/>
+        </w:tabs>
+        <w:ind w:left="1440" w:hanging="360"/>
+      </w:pPr>
+    </w:lvl>
+    <w:lvl w:ilvl="2" w:tentative="1">
+      <w:start w:val="1"/>
+      <w:numFmt w:val="decimal"/>
+      <w:lvlText w:val="%3."/>
+      <w:lvlJc w:val="left"/>
+      <w:pPr>
+        <w:tabs>
+          <w:tab w:val="num" w:pos="2160"/>
+        </w:tabs>
+        <w:ind w:left="2160" w:hanging="360"/>
+      </w:pPr>
+    </w:lvl>
+    <w:lvl w:ilvl="3" w:tentative="1">
+      <w:start w:val="1"/>
+      <w:numFmt w:val="decimal"/>
+      <w:lvlText w:val="%4."/>
+      <w:lvlJc w:val="left"/>
+      <w:pPr>
+        <w:tabs>
+          <w:tab w:val="num" w:pos="2880"/>
+        </w:tabs>
+        <w:ind w:left="2880" w:hanging="360"/>
+      </w:pPr>
+    </w:lvl>
+    <w:lvl w:ilvl="4" w:tentative="1">
+      <w:start w:val="1"/>
+      <w:numFmt w:val="decimal"/>
+      <w:lvlText w:val="%5."/>
+      <w:lvlJc w:val="left"/>
+      <w:pPr>
+        <w:tabs>
+          <w:tab w:val="num" w:pos="3600"/>
+        </w:tabs>
+        <w:ind w:left="3600" w:hanging="360"/>
+      </w:pPr>
+    </w:lvl>
+    <w:lvl w:ilvl="5" w:tentative="1">
+      <w:start w:val="1"/>
+      <w:numFmt w:val="decimal"/>
+      <w:lvlText w:val="%6."/>
+      <w:lvlJc w:val="left"/>
+      <w:pPr>
+        <w:tabs>
+          <w:tab w:val="num" w:pos="4320"/>
+        </w:tabs>
+        <w:ind w:left="4320" w:hanging="360"/>
+      </w:pPr>
+    </w:lvl>
+    <w:lvl w:ilvl="6" w:tentative="1">
+      <w:start w:val="1"/>
+      <w:numFmt w:val="decimal"/>
+      <w:lvlText w:val="%7."/>
+      <w:lvlJc w:val="left"/>
+      <w:pPr>
+        <w:tabs>
+          <w:tab w:val="num" w:pos="5040"/>
+        </w:tabs>
+        <w:ind w:left="5040" w:hanging="360"/>
+      </w:pPr>
+    </w:lvl>
+    <w:lvl w:ilvl="7" w:tentative="1">
+      <w:start w:val="1"/>
+      <w:numFmt w:val="decimal"/>
+      <w:lvlText w:val="%8."/>
+      <w:lvlJc w:val="left"/>
+      <w:pPr>
+        <w:tabs>
+          <w:tab w:val="num" w:pos="5760"/>
+        </w:tabs>
+        <w:ind w:left="5760" w:hanging="360"/>
+      </w:pPr>
+    </w:lvl>
+    <w:lvl w:ilvl="8" w:tentative="1">
+      <w:start w:val="1"/>
+      <w:numFmt w:val="decimal"/>
+      <w:lvlText w:val="%9."/>
+      <w:lvlJc w:val="left"/>
+      <w:pPr>
+        <w:tabs>
+          <w:tab w:val="num" w:pos="6480"/>
+        </w:tabs>
+        <w:ind w:left="6480" w:hanging="360"/>
+      </w:pPr>
+    </w:lvl>
+  </w:abstractNum>
+  <w:abstractNum w:abstractNumId="14" w15:restartNumberingAfterBreak="0">
+    <w:nsid w:val="6FB54FB7"/>
+    <w:multiLevelType w:val="multilevel"/>
+    <w:tmpl w:val="E2DEF860"/>
+    <w:lvl w:ilvl="0">
+      <w:start w:val="1"/>
+      <w:numFmt w:val="decimal"/>
+      <w:lvlText w:val="%1."/>
+      <w:lvlJc w:val="left"/>
+      <w:pPr>
+        <w:tabs>
+          <w:tab w:val="num" w:pos="720"/>
+        </w:tabs>
+        <w:ind w:left="720" w:hanging="360"/>
+      </w:pPr>
+    </w:lvl>
+    <w:lvl w:ilvl="1" w:tentative="1">
+      <w:start w:val="1"/>
+      <w:numFmt w:val="decimal"/>
+      <w:lvlText w:val="%2."/>
+      <w:lvlJc w:val="left"/>
+      <w:pPr>
+        <w:tabs>
+          <w:tab w:val="num" w:pos="1440"/>
+        </w:tabs>
+        <w:ind w:left="1440" w:hanging="360"/>
+      </w:pPr>
+    </w:lvl>
+    <w:lvl w:ilvl="2" w:tentative="1">
+      <w:start w:val="1"/>
+      <w:numFmt w:val="decimal"/>
+      <w:lvlText w:val="%3."/>
+      <w:lvlJc w:val="left"/>
+      <w:pPr>
+        <w:tabs>
+          <w:tab w:val="num" w:pos="2160"/>
+        </w:tabs>
+        <w:ind w:left="2160" w:hanging="360"/>
+      </w:pPr>
+    </w:lvl>
+    <w:lvl w:ilvl="3" w:tentative="1">
+      <w:start w:val="1"/>
+      <w:numFmt w:val="decimal"/>
+      <w:lvlText w:val="%4."/>
+      <w:lvlJc w:val="left"/>
+      <w:pPr>
+        <w:tabs>
+          <w:tab w:val="num" w:pos="2880"/>
+        </w:tabs>
+        <w:ind w:left="2880" w:hanging="360"/>
+      </w:pPr>
+    </w:lvl>
+    <w:lvl w:ilvl="4" w:tentative="1">
+      <w:start w:val="1"/>
+      <w:numFmt w:val="decimal"/>
+      <w:lvlText w:val="%5."/>
+      <w:lvlJc w:val="left"/>
+      <w:pPr>
+        <w:tabs>
+          <w:tab w:val="num" w:pos="3600"/>
+        </w:tabs>
+        <w:ind w:left="3600" w:hanging="360"/>
+      </w:pPr>
+    </w:lvl>
+    <w:lvl w:ilvl="5" w:tentative="1">
+      <w:start w:val="1"/>
+      <w:numFmt w:val="decimal"/>
+      <w:lvlText w:val="%6."/>
+      <w:lvlJc w:val="left"/>
+      <w:pPr>
+        <w:tabs>
+          <w:tab w:val="num" w:pos="4320"/>
+        </w:tabs>
+        <w:ind w:left="4320" w:hanging="360"/>
+      </w:pPr>
+    </w:lvl>
+    <w:lvl w:ilvl="6" w:tentative="1">
+      <w:start w:val="1"/>
+      <w:numFmt w:val="decimal"/>
+      <w:lvlText w:val="%7."/>
+      <w:lvlJc w:val="left"/>
+      <w:pPr>
+        <w:tabs>
+          <w:tab w:val="num" w:pos="5040"/>
+        </w:tabs>
+        <w:ind w:left="5040" w:hanging="360"/>
+      </w:pPr>
+    </w:lvl>
+    <w:lvl w:ilvl="7" w:tentative="1">
+      <w:start w:val="1"/>
+      <w:numFmt w:val="decimal"/>
+      <w:lvlText w:val="%8."/>
+      <w:lvlJc w:val="left"/>
+      <w:pPr>
+        <w:tabs>
+          <w:tab w:val="num" w:pos="5760"/>
+        </w:tabs>
+        <w:ind w:left="5760" w:hanging="360"/>
+      </w:pPr>
+    </w:lvl>
+    <w:lvl w:ilvl="8" w:tentative="1">
+      <w:start w:val="1"/>
+      <w:numFmt w:val="decimal"/>
+      <w:lvlText w:val="%9."/>
+      <w:lvlJc w:val="left"/>
+      <w:pPr>
+        <w:tabs>
+          <w:tab w:val="num" w:pos="6480"/>
+        </w:tabs>
+        <w:ind w:left="6480" w:hanging="360"/>
+      </w:pPr>
+    </w:lvl>
+  </w:abstractNum>
+  <w:abstractNum w:abstractNumId="15" w15:restartNumberingAfterBreak="0">
+    <w:nsid w:val="72C126B6"/>
+    <w:multiLevelType w:val="multilevel"/>
+    <w:tmpl w:val="AEFEEDEC"/>
+    <w:lvl w:ilvl="0">
+      <w:start w:val="1"/>
+      <w:numFmt w:val="decimal"/>
+      <w:lvlText w:val="%1."/>
+      <w:lvlJc w:val="left"/>
+      <w:pPr>
+        <w:tabs>
+          <w:tab w:val="num" w:pos="720"/>
+        </w:tabs>
+        <w:ind w:left="720" w:hanging="360"/>
+      </w:pPr>
+    </w:lvl>
+    <w:lvl w:ilvl="1" w:tentative="1">
+      <w:start w:val="1"/>
+      <w:numFmt w:val="decimal"/>
+      <w:lvlText w:val="%2."/>
+      <w:lvlJc w:val="left"/>
+      <w:pPr>
+        <w:tabs>
+          <w:tab w:val="num" w:pos="1440"/>
+        </w:tabs>
+        <w:ind w:left="1440" w:hanging="360"/>
+      </w:pPr>
+    </w:lvl>
+    <w:lvl w:ilvl="2" w:tentative="1">
+      <w:start w:val="1"/>
+      <w:numFmt w:val="decimal"/>
+      <w:lvlText w:val="%3."/>
+      <w:lvlJc w:val="left"/>
+      <w:pPr>
+        <w:tabs>
+          <w:tab w:val="num" w:pos="2160"/>
+        </w:tabs>
+        <w:ind w:left="2160" w:hanging="360"/>
+      </w:pPr>
+    </w:lvl>
+    <w:lvl w:ilvl="3" w:tentative="1">
+      <w:start w:val="1"/>
+      <w:numFmt w:val="decimal"/>
+      <w:lvlText w:val="%4."/>
+      <w:lvlJc w:val="left"/>
+      <w:pPr>
+        <w:tabs>
+          <w:tab w:val="num" w:pos="2880"/>
+        </w:tabs>
+        <w:ind w:left="2880" w:hanging="360"/>
+      </w:pPr>
+    </w:lvl>
+    <w:lvl w:ilvl="4" w:tentative="1">
+      <w:start w:val="1"/>
+      <w:numFmt w:val="decimal"/>
+      <w:lvlText w:val="%5."/>
+      <w:lvlJc w:val="left"/>
+      <w:pPr>
+        <w:tabs>
+          <w:tab w:val="num" w:pos="3600"/>
+        </w:tabs>
+        <w:ind w:left="3600" w:hanging="360"/>
+      </w:pPr>
+    </w:lvl>
+    <w:lvl w:ilvl="5" w:tentative="1">
+      <w:start w:val="1"/>
+      <w:numFmt w:val="decimal"/>
+      <w:lvlText w:val="%6."/>
+      <w:lvlJc w:val="left"/>
+      <w:pPr>
+        <w:tabs>
+          <w:tab w:val="num" w:pos="4320"/>
+        </w:tabs>
+        <w:ind w:left="4320" w:hanging="360"/>
+      </w:pPr>
+    </w:lvl>
+    <w:lvl w:ilvl="6" w:tentative="1">
+      <w:start w:val="1"/>
+      <w:numFmt w:val="decimal"/>
+      <w:lvlText w:val="%7."/>
+      <w:lvlJc w:val="left"/>
+      <w:pPr>
+        <w:tabs>
+          <w:tab w:val="num" w:pos="5040"/>
+        </w:tabs>
+        <w:ind w:left="5040" w:hanging="360"/>
+      </w:pPr>
+    </w:lvl>
+    <w:lvl w:ilvl="7" w:tentative="1">
+      <w:start w:val="1"/>
+      <w:numFmt w:val="decimal"/>
+      <w:lvlText w:val="%8."/>
+      <w:lvlJc w:val="left"/>
+      <w:pPr>
+        <w:tabs>
+          <w:tab w:val="num" w:pos="5760"/>
+        </w:tabs>
+        <w:ind w:left="5760" w:hanging="360"/>
+      </w:pPr>
+    </w:lvl>
+    <w:lvl w:ilvl="8" w:tentative="1">
+      <w:start w:val="1"/>
+      <w:numFmt w:val="decimal"/>
+      <w:lvlText w:val="%9."/>
+      <w:lvlJc w:val="left"/>
+      <w:pPr>
+        <w:tabs>
+          <w:tab w:val="num" w:pos="6480"/>
+        </w:tabs>
+        <w:ind w:left="6480" w:hanging="360"/>
+      </w:pPr>
+    </w:lvl>
+  </w:abstractNum>
   <w:num w:numId="1" w16cid:durableId="1631667219">
+    <w:abstractNumId w:val="9"/>
+  </w:num>
+  <w:num w:numId="2" w16cid:durableId="2105760105">
+    <w:abstractNumId w:val="12"/>
+  </w:num>
+  <w:num w:numId="3" w16cid:durableId="1996564957">
+    <w:abstractNumId w:val="1"/>
+  </w:num>
+  <w:num w:numId="4" w16cid:durableId="1251810469">
+    <w:abstractNumId w:val="10"/>
+  </w:num>
+  <w:num w:numId="5" w16cid:durableId="696270252">
+    <w:abstractNumId w:val="5"/>
+  </w:num>
+  <w:num w:numId="6" w16cid:durableId="121583810">
+    <w:abstractNumId w:val="4"/>
+  </w:num>
+  <w:num w:numId="7" w16cid:durableId="1164784423">
+    <w:abstractNumId w:val="7"/>
+  </w:num>
+  <w:num w:numId="8" w16cid:durableId="134222347">
+    <w:abstractNumId w:val="6"/>
+  </w:num>
+  <w:num w:numId="9" w16cid:durableId="307248812">
+    <w:abstractNumId w:val="14"/>
+  </w:num>
+  <w:num w:numId="10" w16cid:durableId="1969310498">
     <w:abstractNumId w:val="0"/>
   </w:num>
-  <w:num w:numId="2" w16cid:durableId="2105760105">
-    <w:abstractNumId w:val="1"/>
+  <w:num w:numId="11" w16cid:durableId="315111376">
+    <w:abstractNumId w:val="2"/>
+  </w:num>
+  <w:num w:numId="12" w16cid:durableId="102459013">
+    <w:abstractNumId w:val="13"/>
+  </w:num>
+  <w:num w:numId="13" w16cid:durableId="594247459">
+    <w:abstractNumId w:val="11"/>
+  </w:num>
+  <w:num w:numId="14" w16cid:durableId="1302032255">
+    <w:abstractNumId w:val="8"/>
+  </w:num>
+  <w:num w:numId="15" w16cid:durableId="735053686">
+    <w:abstractNumId w:val="3"/>
+  </w:num>
+  <w:num w:numId="16" w16cid:durableId="192308512">
+    <w:abstractNumId w:val="15"/>
   </w:num>
 </w:numbering>
 </file>

</xml_diff>